<commit_message>
Adicionei pdf e resumo
- Adicionai PDF em materiais des1
- Finalizado resumo de ds1.docx
</commit_message>
<xml_diff>
--- a/semestre-1/desenvolvimento-de-sistemas-1/resumos/resumo-aula02-ds1.docx
+++ b/semestre-1/desenvolvimento-de-sistemas-1/resumos/resumo-aula02-ds1.docx
@@ -110,15 +110,51 @@
           <w:sz w:val="24"/>
           <w:szCs w:val="24"/>
         </w:rPr>
-        <w:t xml:space="preserve">Variável: </w:t>
-      </w:r>
-      <w:r>
-        <w:rPr>
-          <w:rFonts w:ascii="Arial" w:hAnsi="Arial" w:cs="Arial"/>
-          <w:sz w:val="24"/>
-          <w:szCs w:val="24"/>
-        </w:rPr>
-        <w:t xml:space="preserve">é um lugar na memória que guarda algum tipo de dado (valor). </w:t>
+        <w:t>Variável</w:t>
+      </w:r>
+      <w:r>
+        <w:rPr>
+          <w:rFonts w:ascii="Arial" w:hAnsi="Arial" w:cs="Arial"/>
+          <w:b/>
+          <w:bCs/>
+          <w:sz w:val="24"/>
+          <w:szCs w:val="24"/>
+        </w:rPr>
+        <w:t xml:space="preserve"> -</w:t>
+      </w:r>
+      <w:r>
+        <w:rPr>
+          <w:rFonts w:ascii="Arial" w:hAnsi="Arial" w:cs="Arial"/>
+          <w:b/>
+          <w:bCs/>
+          <w:sz w:val="24"/>
+          <w:szCs w:val="24"/>
+        </w:rPr>
+        <w:t xml:space="preserve"> </w:t>
+      </w:r>
+      <w:r>
+        <w:rPr>
+          <w:rFonts w:ascii="Arial" w:hAnsi="Arial" w:cs="Arial"/>
+          <w:sz w:val="24"/>
+          <w:szCs w:val="24"/>
+        </w:rPr>
+        <w:t>é um lugar na memória</w:t>
+      </w:r>
+      <w:r>
+        <w:rPr>
+          <w:rFonts w:ascii="Arial" w:hAnsi="Arial" w:cs="Arial"/>
+          <w:sz w:val="24"/>
+          <w:szCs w:val="24"/>
+        </w:rPr>
+        <w:t xml:space="preserve"> RAM</w:t>
+      </w:r>
+      <w:r>
+        <w:rPr>
+          <w:rFonts w:ascii="Arial" w:hAnsi="Arial" w:cs="Arial"/>
+          <w:sz w:val="24"/>
+          <w:szCs w:val="24"/>
+        </w:rPr>
+        <w:t xml:space="preserve"> que guarda algum tipo de dado (valor). </w:t>
       </w:r>
       <w:r>
         <w:rPr>
@@ -205,6 +241,53 @@
       <w:r>
         <w:rPr>
           <w:rFonts w:ascii="Arial" w:hAnsi="Arial" w:cs="Arial"/>
+          <w:sz w:val="24"/>
+          <w:szCs w:val="24"/>
+        </w:rPr>
+        <w:tab/>
+        <w:t>A variável precisa ser identificada (nome) e possuir um único tipo de dado.</w:t>
+      </w:r>
+      <w:r>
+        <w:rPr>
+          <w:rFonts w:ascii="Arial" w:hAnsi="Arial" w:cs="Arial"/>
+          <w:sz w:val="24"/>
+          <w:szCs w:val="24"/>
+        </w:rPr>
+        <w:t xml:space="preserve"> Ela armazena um único valor por vez.</w:t>
+      </w:r>
+    </w:p>
+    <w:p>
+      <w:pPr>
+        <w:jc w:val="both"/>
+        <w:rPr>
+          <w:rFonts w:ascii="Arial" w:hAnsi="Arial" w:cs="Arial"/>
+          <w:sz w:val="24"/>
+          <w:szCs w:val="24"/>
+        </w:rPr>
+      </w:pPr>
+      <w:r>
+        <w:rPr>
+          <w:rFonts w:ascii="Arial" w:hAnsi="Arial" w:cs="Arial"/>
+          <w:sz w:val="24"/>
+          <w:szCs w:val="24"/>
+        </w:rPr>
+        <w:tab/>
+        <w:t>Por que armazenar dados? O computador precisa “memorizar” um número para que possa somar com outro, caso contrário quando receber o novo ele á esqueceu o antigo.</w:t>
+      </w:r>
+    </w:p>
+    <w:p>
+      <w:pPr>
+        <w:jc w:val="both"/>
+        <w:rPr>
+          <w:rFonts w:ascii="Arial" w:hAnsi="Arial" w:cs="Arial"/>
+          <w:sz w:val="24"/>
+          <w:szCs w:val="24"/>
+        </w:rPr>
+      </w:pPr>
+      <w:r>
+        <w:rPr>
+          <w:rFonts w:ascii="Arial" w:hAnsi="Arial" w:cs="Arial"/>
+          <w:noProof/>
           <w:sz w:val="24"/>
           <w:szCs w:val="24"/>
         </w:rPr>
@@ -365,6 +448,54 @@
         <w:jc w:val="both"/>
         <w:rPr>
           <w:rFonts w:ascii="Arial" w:hAnsi="Arial" w:cs="Arial"/>
+          <w:sz w:val="24"/>
+          <w:szCs w:val="24"/>
+        </w:rPr>
+      </w:pPr>
+      <w:r>
+        <w:rPr>
+          <w:rFonts w:ascii="Arial" w:hAnsi="Arial" w:cs="Arial"/>
+          <w:b/>
+          <w:bCs/>
+          <w:sz w:val="24"/>
+          <w:szCs w:val="24"/>
+        </w:rPr>
+        <w:t xml:space="preserve">Constante </w:t>
+      </w:r>
+      <w:r>
+        <w:rPr>
+          <w:rFonts w:ascii="Arial" w:hAnsi="Arial" w:cs="Arial"/>
+          <w:b/>
+          <w:bCs/>
+          <w:sz w:val="24"/>
+          <w:szCs w:val="24"/>
+        </w:rPr>
+        <w:t>–</w:t>
+      </w:r>
+      <w:r>
+        <w:rPr>
+          <w:rFonts w:ascii="Arial" w:hAnsi="Arial" w:cs="Arial"/>
+          <w:b/>
+          <w:bCs/>
+          <w:sz w:val="24"/>
+          <w:szCs w:val="24"/>
+        </w:rPr>
+        <w:t xml:space="preserve"> </w:t>
+      </w:r>
+      <w:r>
+        <w:rPr>
+          <w:rFonts w:ascii="Arial" w:hAnsi="Arial" w:cs="Arial"/>
+          <w:sz w:val="24"/>
+          <w:szCs w:val="24"/>
+        </w:rPr>
+        <w:t>Local da memória que armazena dados inalteráveis.</w:t>
+      </w:r>
+    </w:p>
+    <w:p>
+      <w:pPr>
+        <w:jc w:val="both"/>
+        <w:rPr>
+          <w:rFonts w:ascii="Arial" w:hAnsi="Arial" w:cs="Arial"/>
           <w:b/>
           <w:bCs/>
           <w:sz w:val="24"/>
@@ -720,25 +851,7 @@
           <w:sz w:val="24"/>
           <w:szCs w:val="24"/>
         </w:rPr>
-        <w:t>Evite abreviações, gírias internas e escolha nomes intuitivos (</w:t>
-      </w:r>
-      <w:proofErr w:type="spellStart"/>
-      <w:r>
-        <w:rPr>
-          <w:rFonts w:ascii="Arial" w:hAnsi="Arial" w:cs="Arial"/>
-          <w:sz w:val="24"/>
-          <w:szCs w:val="24"/>
-        </w:rPr>
-        <w:t>DolarNaoConvertido</w:t>
-      </w:r>
-      <w:proofErr w:type="spellEnd"/>
-      <w:r>
-        <w:rPr>
-          <w:rFonts w:ascii="Arial" w:hAnsi="Arial" w:cs="Arial"/>
-          <w:sz w:val="24"/>
-          <w:szCs w:val="24"/>
-        </w:rPr>
-        <w:t>).</w:t>
+        <w:t>Evite abreviações, gírias internas e escolha nomes intuitivos (DolarNaoConvertido).</w:t>
       </w:r>
     </w:p>
     <w:p>
@@ -784,34 +897,7 @@
           <w:sz w:val="24"/>
           <w:szCs w:val="24"/>
         </w:rPr>
-        <w:t xml:space="preserve">. </w:t>
-      </w:r>
-      <w:proofErr w:type="spellStart"/>
-      <w:r>
-        <w:rPr>
-          <w:rFonts w:ascii="Arial" w:hAnsi="Arial" w:cs="Arial"/>
-          <w:sz w:val="24"/>
-          <w:szCs w:val="24"/>
-        </w:rPr>
-        <w:t>Usuario</w:t>
-      </w:r>
-      <w:proofErr w:type="spellEnd"/>
-      <w:r>
-        <w:rPr>
-          <w:rFonts w:ascii="Arial" w:hAnsi="Arial" w:cs="Arial"/>
-          <w:sz w:val="24"/>
-          <w:szCs w:val="24"/>
-        </w:rPr>
-        <w:t xml:space="preserve"> = formulário -&gt; </w:t>
-      </w:r>
-      <w:proofErr w:type="gramStart"/>
-      <w:r>
-        <w:rPr>
-          <w:rFonts w:ascii="Arial" w:hAnsi="Arial" w:cs="Arial"/>
-          <w:sz w:val="24"/>
-          <w:szCs w:val="24"/>
-        </w:rPr>
-        <w:t xml:space="preserve">nome; </w:t>
+        <w:t xml:space="preserve">. Usuario = formulário -&gt; nome; </w:t>
       </w:r>
       <w:r>
         <w:rPr>
@@ -827,16 +913,7 @@
           <w:sz w:val="24"/>
           <w:szCs w:val="24"/>
         </w:rPr>
-        <w:t>Telefone</w:t>
-      </w:r>
-      <w:proofErr w:type="gramEnd"/>
-      <w:r>
-        <w:rPr>
-          <w:rFonts w:ascii="Arial" w:hAnsi="Arial" w:cs="Arial"/>
-          <w:sz w:val="24"/>
-          <w:szCs w:val="24"/>
-        </w:rPr>
-        <w:t xml:space="preserve"> = formulário -&gt; telefone;</w:t>
+        <w:t>Telefone = formulário -&gt; telefone;</w:t>
       </w:r>
       <w:r>
         <w:rPr>
@@ -852,25 +929,7 @@
           <w:sz w:val="24"/>
           <w:szCs w:val="24"/>
         </w:rPr>
-        <w:t xml:space="preserve">As variáveis </w:t>
-      </w:r>
-      <w:proofErr w:type="spellStart"/>
-      <w:r>
-        <w:rPr>
-          <w:rFonts w:ascii="Arial" w:hAnsi="Arial" w:cs="Arial"/>
-          <w:sz w:val="24"/>
-          <w:szCs w:val="24"/>
-        </w:rPr>
-        <w:t>Usuario</w:t>
-      </w:r>
-      <w:proofErr w:type="spellEnd"/>
-      <w:r>
-        <w:rPr>
-          <w:rFonts w:ascii="Arial" w:hAnsi="Arial" w:cs="Arial"/>
-          <w:sz w:val="24"/>
-          <w:szCs w:val="24"/>
-        </w:rPr>
-        <w:t xml:space="preserve"> e Telefone = (recebem) os dados das respectivas entradas.</w:t>
+        <w:t>As variáveis Usuario e Telefone = (recebem) os dados das respectivas entradas.</w:t>
       </w:r>
     </w:p>
     <w:p>
@@ -906,25 +965,7 @@
           <w:sz w:val="24"/>
           <w:szCs w:val="24"/>
         </w:rPr>
-        <w:t>“Olá [</w:t>
-      </w:r>
-      <w:proofErr w:type="spellStart"/>
-      <w:r>
-        <w:rPr>
-          <w:rFonts w:ascii="Arial" w:hAnsi="Arial" w:cs="Arial"/>
-          <w:sz w:val="24"/>
-          <w:szCs w:val="24"/>
-        </w:rPr>
-        <w:t>Usuario</w:t>
-      </w:r>
-      <w:proofErr w:type="spellEnd"/>
-      <w:r>
-        <w:rPr>
-          <w:rFonts w:ascii="Arial" w:hAnsi="Arial" w:cs="Arial"/>
-          <w:sz w:val="24"/>
-          <w:szCs w:val="24"/>
-        </w:rPr>
-        <w:t>], seu número de telefone foi cadastrado, ligaremos para [Telefone].</w:t>
+        <w:t>“Olá [Usuario], seu número de telefone foi cadastrado, ligaremos para [Telefone].</w:t>
       </w:r>
     </w:p>
     <w:p>
@@ -959,25 +1000,7 @@
             <w:sz w:val="24"/>
             <w:szCs w:val="24"/>
           </w:rPr>
-          <w:t>https://www.youtube.com/</w:t>
-        </w:r>
-        <w:r>
-          <w:rPr>
-            <w:rStyle w:val="Hyperlink"/>
-            <w:rFonts w:ascii="Arial" w:hAnsi="Arial" w:cs="Arial"/>
-            <w:sz w:val="24"/>
-            <w:szCs w:val="24"/>
-          </w:rPr>
-          <w:t>w</w:t>
-        </w:r>
-        <w:r>
-          <w:rPr>
-            <w:rStyle w:val="Hyperlink"/>
-            <w:rFonts w:ascii="Arial" w:hAnsi="Arial" w:cs="Arial"/>
-            <w:sz w:val="24"/>
-            <w:szCs w:val="24"/>
-          </w:rPr>
-          <w:t>atch?v=SEQ57ilIdy4</w:t>
+          <w:t>https://www.youtube.com/watch?v=SEQ57ilIdy4</w:t>
         </w:r>
       </w:hyperlink>
       <w:r>
@@ -986,25 +1009,7 @@
           <w:sz w:val="24"/>
           <w:szCs w:val="24"/>
         </w:rPr>
-        <w:t xml:space="preserve"> (</w:t>
-      </w:r>
-      <w:proofErr w:type="spellStart"/>
-      <w:r>
-        <w:rPr>
-          <w:rFonts w:ascii="Arial" w:hAnsi="Arial" w:cs="Arial"/>
-          <w:sz w:val="24"/>
-          <w:szCs w:val="24"/>
-        </w:rPr>
-        <w:t>Cataline</w:t>
-      </w:r>
-      <w:proofErr w:type="spellEnd"/>
-      <w:r>
-        <w:rPr>
-          <w:rFonts w:ascii="Arial" w:hAnsi="Arial" w:cs="Arial"/>
-          <w:sz w:val="24"/>
-          <w:szCs w:val="24"/>
-        </w:rPr>
-        <w:t xml:space="preserve"> – Lógica de programação 04 – Variáveis).</w:t>
+        <w:t xml:space="preserve"> (Cataline – Lógica de programação 04 – Variáveis).</w:t>
       </w:r>
     </w:p>
     <w:p>
@@ -1038,49 +1043,7 @@
           <w:sz w:val="24"/>
           <w:szCs w:val="24"/>
         </w:rPr>
-        <w:t xml:space="preserve"> (</w:t>
-      </w:r>
-      <w:proofErr w:type="spellStart"/>
-      <w:r>
-        <w:rPr>
-          <w:rFonts w:ascii="Arial" w:hAnsi="Arial" w:cs="Arial"/>
-          <w:sz w:val="24"/>
-          <w:szCs w:val="24"/>
-        </w:rPr>
-        <w:t>Cataline</w:t>
-      </w:r>
-      <w:proofErr w:type="spellEnd"/>
-      <w:r>
-        <w:rPr>
-          <w:rFonts w:ascii="Arial" w:hAnsi="Arial" w:cs="Arial"/>
-          <w:sz w:val="24"/>
-          <w:szCs w:val="24"/>
-        </w:rPr>
-        <w:t xml:space="preserve"> – Lógica de programação 0</w:t>
-      </w:r>
-      <w:r>
-        <w:rPr>
-          <w:rFonts w:ascii="Arial" w:hAnsi="Arial" w:cs="Arial"/>
-          <w:sz w:val="24"/>
-          <w:szCs w:val="24"/>
-        </w:rPr>
-        <w:t>5</w:t>
-      </w:r>
-      <w:r>
-        <w:rPr>
-          <w:rFonts w:ascii="Arial" w:hAnsi="Arial" w:cs="Arial"/>
-          <w:sz w:val="24"/>
-          <w:szCs w:val="24"/>
-        </w:rPr>
-        <w:t xml:space="preserve"> – </w:t>
-      </w:r>
-      <w:r>
-        <w:rPr>
-          <w:rFonts w:ascii="Arial" w:hAnsi="Arial" w:cs="Arial"/>
-          <w:sz w:val="24"/>
-          <w:szCs w:val="24"/>
-        </w:rPr>
-        <w:t>Tipos de dados).</w:t>
+        <w:t xml:space="preserve"> (Cataline – Lógica de programação 05 – Tipos de dados).</w:t>
       </w:r>
     </w:p>
     <w:p>
@@ -1141,6 +1104,7 @@
           <w:sz w:val="24"/>
           <w:szCs w:val="24"/>
         </w:rPr>
+        <w:lastRenderedPageBreak/>
         <w:t>Inteiro</w:t>
       </w:r>
       <w:r>
@@ -1151,29 +1115,7 @@
           <w:sz w:val="24"/>
           <w:szCs w:val="24"/>
         </w:rPr>
-        <w:t xml:space="preserve"> (</w:t>
-      </w:r>
-      <w:proofErr w:type="spellStart"/>
-      <w:r>
-        <w:rPr>
-          <w:rFonts w:ascii="Arial" w:hAnsi="Arial" w:cs="Arial"/>
-          <w:b/>
-          <w:bCs/>
-          <w:sz w:val="24"/>
-          <w:szCs w:val="24"/>
-        </w:rPr>
-        <w:t>Integer</w:t>
-      </w:r>
-      <w:proofErr w:type="spellEnd"/>
-      <w:r>
-        <w:rPr>
-          <w:rFonts w:ascii="Arial" w:hAnsi="Arial" w:cs="Arial"/>
-          <w:b/>
-          <w:bCs/>
-          <w:sz w:val="24"/>
-          <w:szCs w:val="24"/>
-        </w:rPr>
-        <w:t>)</w:t>
+        <w:t xml:space="preserve"> (Integer)</w:t>
       </w:r>
       <w:r>
         <w:rPr>
@@ -1236,29 +1178,7 @@
           <w:sz w:val="24"/>
           <w:szCs w:val="24"/>
         </w:rPr>
-        <w:t xml:space="preserve"> (</w:t>
-      </w:r>
-      <w:proofErr w:type="spellStart"/>
-      <w:r>
-        <w:rPr>
-          <w:rFonts w:ascii="Arial" w:hAnsi="Arial" w:cs="Arial"/>
-          <w:b/>
-          <w:bCs/>
-          <w:sz w:val="24"/>
-          <w:szCs w:val="24"/>
-        </w:rPr>
-        <w:t>Float</w:t>
-      </w:r>
-      <w:proofErr w:type="spellEnd"/>
-      <w:r>
-        <w:rPr>
-          <w:rFonts w:ascii="Arial" w:hAnsi="Arial" w:cs="Arial"/>
-          <w:b/>
-          <w:bCs/>
-          <w:sz w:val="24"/>
-          <w:szCs w:val="24"/>
-        </w:rPr>
-        <w:t>)</w:t>
+        <w:t xml:space="preserve"> (Float)</w:t>
       </w:r>
       <w:r>
         <w:rPr>
@@ -1321,29 +1241,7 @@
           <w:sz w:val="24"/>
           <w:szCs w:val="24"/>
         </w:rPr>
-        <w:t xml:space="preserve"> (</w:t>
-      </w:r>
-      <w:proofErr w:type="spellStart"/>
-      <w:r>
-        <w:rPr>
-          <w:rFonts w:ascii="Arial" w:hAnsi="Arial" w:cs="Arial"/>
-          <w:b/>
-          <w:bCs/>
-          <w:sz w:val="24"/>
-          <w:szCs w:val="24"/>
-        </w:rPr>
-        <w:t>String</w:t>
-      </w:r>
-      <w:proofErr w:type="spellEnd"/>
-      <w:r>
-        <w:rPr>
-          <w:rFonts w:ascii="Arial" w:hAnsi="Arial" w:cs="Arial"/>
-          <w:b/>
-          <w:bCs/>
-          <w:sz w:val="24"/>
-          <w:szCs w:val="24"/>
-        </w:rPr>
-        <w:t>)</w:t>
+        <w:t xml:space="preserve"> (String)</w:t>
       </w:r>
       <w:r>
         <w:rPr>
@@ -1363,7 +1261,6 @@
         </w:rPr>
         <w:t xml:space="preserve">É uma </w:t>
       </w:r>
-      <w:proofErr w:type="spellStart"/>
       <w:r>
         <w:rPr>
           <w:rFonts w:ascii="Arial" w:hAnsi="Arial" w:cs="Arial"/>
@@ -1372,18 +1269,7 @@
           <w:sz w:val="24"/>
           <w:szCs w:val="24"/>
         </w:rPr>
-        <w:t>string</w:t>
-      </w:r>
-      <w:proofErr w:type="spellEnd"/>
-      <w:r>
-        <w:rPr>
-          <w:rFonts w:ascii="Arial" w:hAnsi="Arial" w:cs="Arial"/>
-          <w:i/>
-          <w:iCs/>
-          <w:sz w:val="24"/>
-          <w:szCs w:val="24"/>
-        </w:rPr>
-        <w:t xml:space="preserve"> -</w:t>
+        <w:t>string -</w:t>
       </w:r>
       <w:r>
         <w:rPr>
@@ -1420,7 +1306,6 @@
         </w:rPr>
         <w:t>Lógico (</w:t>
       </w:r>
-      <w:proofErr w:type="spellStart"/>
       <w:r>
         <w:rPr>
           <w:rFonts w:ascii="Arial" w:hAnsi="Arial" w:cs="Arial"/>
@@ -1439,18 +1324,7 @@
           <w:sz w:val="24"/>
           <w:szCs w:val="24"/>
         </w:rPr>
-        <w:t>oolean</w:t>
-      </w:r>
-      <w:proofErr w:type="spellEnd"/>
-      <w:r>
-        <w:rPr>
-          <w:rFonts w:ascii="Arial" w:hAnsi="Arial" w:cs="Arial"/>
-          <w:b/>
-          <w:bCs/>
-          <w:sz w:val="24"/>
-          <w:szCs w:val="24"/>
-        </w:rPr>
-        <w:t xml:space="preserve">): </w:t>
+        <w:t xml:space="preserve">oolean): </w:t>
       </w:r>
       <w:r>
         <w:rPr>
@@ -1483,6 +1357,7 @@
       <w:r>
         <w:rPr>
           <w:rFonts w:ascii="Arial" w:hAnsi="Arial" w:cs="Arial"/>
+          <w:noProof/>
           <w:sz w:val="24"/>
           <w:szCs w:val="24"/>
         </w:rPr>
@@ -1558,49 +1433,7 @@
           <w:sz w:val="24"/>
           <w:szCs w:val="24"/>
         </w:rPr>
-        <w:t xml:space="preserve">Tipos de dados (tipos </w:t>
-      </w:r>
-      <w:r>
-        <w:rPr>
-          <w:rFonts w:ascii="Arial" w:hAnsi="Arial" w:cs="Arial"/>
-          <w:b/>
-          <w:bCs/>
-          <w:sz w:val="24"/>
-          <w:szCs w:val="24"/>
-        </w:rPr>
-        <w:t xml:space="preserve">Vetor / </w:t>
-      </w:r>
-      <w:proofErr w:type="spellStart"/>
-      <w:r>
-        <w:rPr>
-          <w:rFonts w:ascii="Arial" w:hAnsi="Arial" w:cs="Arial"/>
-          <w:b/>
-          <w:bCs/>
-          <w:sz w:val="24"/>
-          <w:szCs w:val="24"/>
-        </w:rPr>
-        <w:t>Array</w:t>
-      </w:r>
-      <w:proofErr w:type="spellEnd"/>
-      <w:r>
-        <w:rPr>
-          <w:rFonts w:ascii="Arial" w:hAnsi="Arial" w:cs="Arial"/>
-          <w:b/>
-          <w:bCs/>
-          <w:sz w:val="24"/>
-          <w:szCs w:val="24"/>
-        </w:rPr>
-        <w:t>):</w:t>
-      </w:r>
-      <w:r>
-        <w:rPr>
-          <w:rFonts w:ascii="Arial" w:hAnsi="Arial" w:cs="Arial"/>
-          <w:b/>
-          <w:bCs/>
-          <w:sz w:val="24"/>
-          <w:szCs w:val="24"/>
-        </w:rPr>
-        <w:t xml:space="preserve"> </w:t>
+        <w:t xml:space="preserve">Tipos de dados (tipos Vetor / Array): </w:t>
       </w:r>
     </w:p>
     <w:p>
@@ -1619,32 +1452,7 @@
           <w:szCs w:val="24"/>
         </w:rPr>
         <w:tab/>
-      </w:r>
-      <w:r>
-        <w:rPr>
-          <w:rFonts w:ascii="Arial" w:hAnsi="Arial" w:cs="Arial"/>
-          <w:sz w:val="24"/>
-          <w:szCs w:val="24"/>
-        </w:rPr>
-        <w:t xml:space="preserve">Tipo de dado composto. Na maioria das linguagens definida por </w:t>
-      </w:r>
-      <w:proofErr w:type="gramStart"/>
-      <w:r>
-        <w:rPr>
-          <w:rFonts w:ascii="Arial" w:hAnsi="Arial" w:cs="Arial"/>
-          <w:sz w:val="24"/>
-          <w:szCs w:val="24"/>
-        </w:rPr>
-        <w:t>[ ]</w:t>
-      </w:r>
-      <w:proofErr w:type="gramEnd"/>
-      <w:r>
-        <w:rPr>
-          <w:rFonts w:ascii="Arial" w:hAnsi="Arial" w:cs="Arial"/>
-          <w:sz w:val="24"/>
-          <w:szCs w:val="24"/>
-        </w:rPr>
-        <w:t xml:space="preserve">. Um vetor pode acomodar vários dados de tipo primitivo dentro dele e além disso enumera esses dados por meio de um </w:t>
+        <w:t xml:space="preserve">Tipo de dado composto. Na maioria das linguagens definida por [ ]. Um vetor pode acomodar vários dados de tipo primitivo dentro dele e além disso enumera esses dados por meio de um </w:t>
       </w:r>
       <w:r>
         <w:rPr>
@@ -1830,27 +1638,7 @@
           <w:sz w:val="24"/>
           <w:szCs w:val="24"/>
         </w:rPr>
-        <w:t>Subtração</w:t>
-      </w:r>
-      <w:r>
-        <w:rPr>
-          <w:rFonts w:ascii="Arial" w:hAnsi="Arial" w:cs="Arial"/>
-          <w:b/>
-          <w:bCs/>
-          <w:sz w:val="24"/>
-          <w:szCs w:val="24"/>
-        </w:rPr>
-        <w:t>:</w:t>
-      </w:r>
-      <w:r>
-        <w:rPr>
-          <w:rFonts w:ascii="Arial" w:hAnsi="Arial" w:cs="Arial"/>
-          <w:b/>
-          <w:bCs/>
-          <w:sz w:val="24"/>
-          <w:szCs w:val="24"/>
-        </w:rPr>
-        <w:t xml:space="preserve"> </w:t>
+        <w:t xml:space="preserve">Subtração: </w:t>
       </w:r>
       <w:r>
         <w:rPr>
@@ -1885,27 +1673,7 @@
           <w:sz w:val="24"/>
           <w:szCs w:val="24"/>
         </w:rPr>
-        <w:t>Multiplicação</w:t>
-      </w:r>
-      <w:r>
-        <w:rPr>
-          <w:rFonts w:ascii="Arial" w:hAnsi="Arial" w:cs="Arial"/>
-          <w:b/>
-          <w:bCs/>
-          <w:sz w:val="24"/>
-          <w:szCs w:val="24"/>
-        </w:rPr>
-        <w:t>:</w:t>
-      </w:r>
-      <w:r>
-        <w:rPr>
-          <w:rFonts w:ascii="Arial" w:hAnsi="Arial" w:cs="Arial"/>
-          <w:b/>
-          <w:bCs/>
-          <w:sz w:val="24"/>
-          <w:szCs w:val="24"/>
-        </w:rPr>
-        <w:t xml:space="preserve"> </w:t>
+        <w:t xml:space="preserve">Multiplicação: </w:t>
       </w:r>
       <w:r>
         <w:rPr>
@@ -1940,27 +1708,7 @@
           <w:sz w:val="24"/>
           <w:szCs w:val="24"/>
         </w:rPr>
-        <w:t>Divisão</w:t>
-      </w:r>
-      <w:r>
-        <w:rPr>
-          <w:rFonts w:ascii="Arial" w:hAnsi="Arial" w:cs="Arial"/>
-          <w:b/>
-          <w:bCs/>
-          <w:sz w:val="24"/>
-          <w:szCs w:val="24"/>
-        </w:rPr>
-        <w:t>:</w:t>
-      </w:r>
-      <w:r>
-        <w:rPr>
-          <w:rFonts w:ascii="Arial" w:hAnsi="Arial" w:cs="Arial"/>
-          <w:b/>
-          <w:bCs/>
-          <w:sz w:val="24"/>
-          <w:szCs w:val="24"/>
-        </w:rPr>
-        <w:t xml:space="preserve"> </w:t>
+        <w:t xml:space="preserve">Divisão: </w:t>
       </w:r>
       <w:r>
         <w:rPr>
@@ -2023,25 +1771,7 @@
           <w:sz w:val="24"/>
           <w:szCs w:val="24"/>
         </w:rPr>
-        <w:t xml:space="preserve">% </w:t>
-      </w:r>
-      <w:proofErr w:type="spellStart"/>
-      <w:r>
-        <w:rPr>
-          <w:rFonts w:ascii="Arial" w:hAnsi="Arial" w:cs="Arial"/>
-          <w:sz w:val="24"/>
-          <w:szCs w:val="24"/>
-        </w:rPr>
-        <w:t>ex</w:t>
-      </w:r>
-      <w:proofErr w:type="spellEnd"/>
-      <w:r>
-        <w:rPr>
-          <w:rFonts w:ascii="Arial" w:hAnsi="Arial" w:cs="Arial"/>
-          <w:sz w:val="24"/>
-          <w:szCs w:val="24"/>
-        </w:rPr>
-        <w:t>: 5 % 2 = 1</w:t>
+        <w:t>% ex: 5 % 2 = 1</w:t>
       </w:r>
     </w:p>
     <w:p>
@@ -2153,55 +1883,13 @@
         </w:rPr>
         <w:t xml:space="preserve"> (</w:t>
       </w:r>
-      <w:proofErr w:type="spellStart"/>
-      <w:r>
-        <w:rPr>
-          <w:rFonts w:ascii="Arial" w:hAnsi="Arial" w:cs="Arial"/>
-          <w:sz w:val="24"/>
-          <w:szCs w:val="24"/>
-        </w:rPr>
-        <w:t>Cataline</w:t>
-      </w:r>
-      <w:proofErr w:type="spellEnd"/>
-      <w:r>
-        <w:rPr>
-          <w:rFonts w:ascii="Arial" w:hAnsi="Arial" w:cs="Arial"/>
-          <w:sz w:val="24"/>
-          <w:szCs w:val="24"/>
-        </w:rPr>
-        <w:t xml:space="preserve"> – Lógica de programação 0</w:t>
-      </w:r>
-      <w:r>
-        <w:rPr>
-          <w:rFonts w:ascii="Arial" w:hAnsi="Arial" w:cs="Arial"/>
-          <w:sz w:val="24"/>
-          <w:szCs w:val="24"/>
-        </w:rPr>
-        <w:t>6</w:t>
-      </w:r>
-      <w:r>
-        <w:rPr>
-          <w:rFonts w:ascii="Arial" w:hAnsi="Arial" w:cs="Arial"/>
-          <w:sz w:val="24"/>
-          <w:szCs w:val="24"/>
-        </w:rPr>
-        <w:t xml:space="preserve"> – </w:t>
-      </w:r>
-      <w:r>
-        <w:rPr>
-          <w:rFonts w:ascii="Arial" w:hAnsi="Arial" w:cs="Arial"/>
-          <w:sz w:val="24"/>
-          <w:szCs w:val="24"/>
-        </w:rPr>
-        <w:t>Operadores matemáticos</w:t>
-      </w:r>
-      <w:r>
-        <w:rPr>
-          <w:rFonts w:ascii="Arial" w:hAnsi="Arial" w:cs="Arial"/>
-          <w:sz w:val="24"/>
-          <w:szCs w:val="24"/>
-        </w:rPr>
-        <w:t>).</w:t>
+      <w:r>
+        <w:rPr>
+          <w:rFonts w:ascii="Arial" w:hAnsi="Arial" w:cs="Arial"/>
+          <w:sz w:val="24"/>
+          <w:szCs w:val="24"/>
+        </w:rPr>
+        <w:t>Cataline – Lógica de programação 06 – Operadores matemáticos).</w:t>
       </w:r>
     </w:p>
     <w:p>
@@ -2247,25 +1935,7 @@
           <w:sz w:val="24"/>
           <w:szCs w:val="24"/>
         </w:rPr>
-        <w:t xml:space="preserve"> (</w:t>
-      </w:r>
-      <w:proofErr w:type="spellStart"/>
-      <w:r>
-        <w:rPr>
-          <w:rFonts w:ascii="Arial" w:hAnsi="Arial" w:cs="Arial"/>
-          <w:sz w:val="24"/>
-          <w:szCs w:val="24"/>
-        </w:rPr>
-        <w:t>booleans</w:t>
-      </w:r>
-      <w:proofErr w:type="spellEnd"/>
-      <w:r>
-        <w:rPr>
-          <w:rFonts w:ascii="Arial" w:hAnsi="Arial" w:cs="Arial"/>
-          <w:sz w:val="24"/>
-          <w:szCs w:val="24"/>
-        </w:rPr>
-        <w:t>)</w:t>
+        <w:t xml:space="preserve"> (booleans)</w:t>
       </w:r>
       <w:r>
         <w:rPr>
@@ -2290,6 +1960,7 @@
           <w:rFonts w:ascii="Arial" w:hAnsi="Arial" w:cs="Arial"/>
           <w:b/>
           <w:bCs/>
+          <w:noProof/>
           <w:sz w:val="24"/>
           <w:szCs w:val="24"/>
         </w:rPr>
@@ -2372,6 +2043,7 @@
       <w:r>
         <w:rPr>
           <w:rFonts w:ascii="Arial" w:hAnsi="Arial" w:cs="Arial"/>
+          <w:noProof/>
           <w:sz w:val="24"/>
           <w:szCs w:val="24"/>
         </w:rPr>
@@ -2503,23 +2175,7 @@
           <w:sz w:val="24"/>
           <w:szCs w:val="24"/>
         </w:rPr>
-        <w:t>M</w:t>
-      </w:r>
-      <w:r>
-        <w:rPr>
-          <w:rFonts w:ascii="Arial" w:hAnsi="Arial" w:cs="Arial"/>
-          <w:sz w:val="24"/>
-          <w:szCs w:val="24"/>
-        </w:rPr>
-        <w:t>enor</w:t>
-      </w:r>
-      <w:r>
-        <w:rPr>
-          <w:rFonts w:ascii="Arial" w:hAnsi="Arial" w:cs="Arial"/>
-          <w:sz w:val="24"/>
-          <w:szCs w:val="24"/>
-        </w:rPr>
-        <w:t xml:space="preserve"> que</w:t>
+        <w:t>Menor que</w:t>
       </w:r>
     </w:p>
     <w:p>
@@ -2708,27 +2364,15 @@
           <w:szCs w:val="24"/>
         </w:rPr>
       </w:pPr>
-      <w:proofErr w:type="gramStart"/>
-      <w:r>
-        <w:rPr>
-          <w:rFonts w:ascii="Arial" w:hAnsi="Arial" w:cs="Arial"/>
-          <w:b/>
-          <w:bCs/>
-          <w:sz w:val="24"/>
-          <w:szCs w:val="24"/>
-        </w:rPr>
-        <w:t>!=</w:t>
-      </w:r>
-      <w:proofErr w:type="gramEnd"/>
-      <w:r>
-        <w:rPr>
-          <w:rFonts w:ascii="Arial" w:hAnsi="Arial" w:cs="Arial"/>
-          <w:b/>
-          <w:bCs/>
-          <w:sz w:val="24"/>
-          <w:szCs w:val="24"/>
-        </w:rPr>
-        <w:t xml:space="preserve"> </w:t>
+      <w:r>
+        <w:rPr>
+          <w:rFonts w:ascii="Arial" w:hAnsi="Arial" w:cs="Arial"/>
+          <w:b/>
+          <w:bCs/>
+          <w:sz w:val="24"/>
+          <w:szCs w:val="24"/>
+        </w:rPr>
+        <w:t xml:space="preserve">!= </w:t>
       </w:r>
       <w:r>
         <w:rPr>
@@ -2753,27 +2397,15 @@
           <w:szCs w:val="24"/>
         </w:rPr>
       </w:pPr>
-      <w:proofErr w:type="gramStart"/>
-      <w:r>
-        <w:rPr>
-          <w:rFonts w:ascii="Arial" w:hAnsi="Arial" w:cs="Arial"/>
-          <w:b/>
-          <w:bCs/>
-          <w:sz w:val="24"/>
-          <w:szCs w:val="24"/>
-        </w:rPr>
-        <w:t>!=</w:t>
-      </w:r>
-      <w:proofErr w:type="gramEnd"/>
-      <w:r>
-        <w:rPr>
-          <w:rFonts w:ascii="Arial" w:hAnsi="Arial" w:cs="Arial"/>
-          <w:b/>
-          <w:bCs/>
-          <w:sz w:val="24"/>
-          <w:szCs w:val="24"/>
-        </w:rPr>
-        <w:t xml:space="preserve">= </w:t>
+      <w:r>
+        <w:rPr>
+          <w:rFonts w:ascii="Arial" w:hAnsi="Arial" w:cs="Arial"/>
+          <w:b/>
+          <w:bCs/>
+          <w:sz w:val="24"/>
+          <w:szCs w:val="24"/>
+        </w:rPr>
+        <w:t xml:space="preserve">!== </w:t>
       </w:r>
       <w:r>
         <w:rPr>
@@ -2833,29 +2465,7 @@
             <w:sz w:val="24"/>
             <w:szCs w:val="24"/>
           </w:rPr>
-          <w:t>https://www.youtube.com/watch?v=s12</w:t>
-        </w:r>
-        <w:r>
-          <w:rPr>
-            <w:rStyle w:val="Hyperlink"/>
-            <w:rFonts w:ascii="Arial" w:hAnsi="Arial" w:cs="Arial"/>
-            <w:b/>
-            <w:bCs/>
-            <w:sz w:val="24"/>
-            <w:szCs w:val="24"/>
-          </w:rPr>
-          <w:t>-</w:t>
-        </w:r>
-        <w:r>
-          <w:rPr>
-            <w:rStyle w:val="Hyperlink"/>
-            <w:rFonts w:ascii="Arial" w:hAnsi="Arial" w:cs="Arial"/>
-            <w:b/>
-            <w:bCs/>
-            <w:sz w:val="24"/>
-            <w:szCs w:val="24"/>
-          </w:rPr>
-          <w:t>dd6PxU0</w:t>
+          <w:t>https://www.youtube.com/watch?v=s12-dd6PxU0</w:t>
         </w:r>
       </w:hyperlink>
       <w:r>
@@ -2888,105 +2498,43 @@
         </w:rPr>
         <w:t>(</w:t>
       </w:r>
-      <w:proofErr w:type="spellStart"/>
-      <w:r>
-        <w:rPr>
-          <w:rFonts w:ascii="Arial" w:hAnsi="Arial" w:cs="Arial"/>
-          <w:sz w:val="24"/>
-          <w:szCs w:val="24"/>
-        </w:rPr>
-        <w:t>Cataline</w:t>
-      </w:r>
-      <w:proofErr w:type="spellEnd"/>
-      <w:r>
-        <w:rPr>
-          <w:rFonts w:ascii="Arial" w:hAnsi="Arial" w:cs="Arial"/>
-          <w:sz w:val="24"/>
-          <w:szCs w:val="24"/>
-        </w:rPr>
-        <w:t xml:space="preserve"> – Lógica de programação 0</w:t>
-      </w:r>
-      <w:r>
-        <w:rPr>
-          <w:rFonts w:ascii="Arial" w:hAnsi="Arial" w:cs="Arial"/>
-          <w:sz w:val="24"/>
-          <w:szCs w:val="24"/>
-        </w:rPr>
-        <w:t>7</w:t>
-      </w:r>
-      <w:r>
-        <w:rPr>
-          <w:rFonts w:ascii="Arial" w:hAnsi="Arial" w:cs="Arial"/>
-          <w:sz w:val="24"/>
-          <w:szCs w:val="24"/>
-        </w:rPr>
-        <w:t xml:space="preserve"> – Operadores </w:t>
-      </w:r>
-      <w:r>
-        <w:rPr>
-          <w:rFonts w:ascii="Arial" w:hAnsi="Arial" w:cs="Arial"/>
-          <w:sz w:val="24"/>
-          <w:szCs w:val="24"/>
-        </w:rPr>
-        <w:t>de comparação</w:t>
-      </w:r>
-      <w:r>
-        <w:rPr>
-          <w:rFonts w:ascii="Arial" w:hAnsi="Arial" w:cs="Arial"/>
-          <w:sz w:val="24"/>
-          <w:szCs w:val="24"/>
-        </w:rPr>
-        <w:t>).</w:t>
-      </w:r>
-    </w:p>
-    <w:p>
-      <w:pPr>
-        <w:jc w:val="both"/>
-        <w:rPr>
-          <w:rFonts w:ascii="Arial" w:hAnsi="Arial" w:cs="Arial"/>
-          <w:sz w:val="24"/>
-          <w:szCs w:val="24"/>
-        </w:rPr>
-      </w:pPr>
-    </w:p>
-    <w:p>
-      <w:pPr>
-        <w:jc w:val="both"/>
-        <w:rPr>
-          <w:rFonts w:ascii="Arial" w:hAnsi="Arial" w:cs="Arial"/>
-          <w:sz w:val="24"/>
-          <w:szCs w:val="24"/>
-        </w:rPr>
-      </w:pPr>
-      <w:r>
-        <w:rPr>
-          <w:rFonts w:ascii="Arial" w:hAnsi="Arial" w:cs="Arial"/>
-          <w:b/>
-          <w:bCs/>
-          <w:sz w:val="24"/>
-          <w:szCs w:val="24"/>
-        </w:rPr>
-        <w:t xml:space="preserve">Operadores </w:t>
-      </w:r>
-      <w:r>
-        <w:rPr>
-          <w:rFonts w:ascii="Arial" w:hAnsi="Arial" w:cs="Arial"/>
-          <w:b/>
-          <w:bCs/>
-          <w:sz w:val="24"/>
-          <w:szCs w:val="24"/>
-        </w:rPr>
-        <w:t>Lógicos</w:t>
-      </w:r>
-      <w:r>
-        <w:rPr>
-          <w:rFonts w:ascii="Arial" w:hAnsi="Arial" w:cs="Arial"/>
-          <w:b/>
-          <w:bCs/>
-          <w:sz w:val="24"/>
-          <w:szCs w:val="24"/>
-        </w:rPr>
-        <w:t xml:space="preserve">: </w:t>
+      <w:r>
+        <w:rPr>
+          <w:rFonts w:ascii="Arial" w:hAnsi="Arial" w:cs="Arial"/>
+          <w:sz w:val="24"/>
+          <w:szCs w:val="24"/>
+        </w:rPr>
+        <w:t>Cataline – Lógica de programação 07 – Operadores de comparação).</w:t>
+      </w:r>
+    </w:p>
+    <w:p>
+      <w:pPr>
+        <w:jc w:val="both"/>
+        <w:rPr>
+          <w:rFonts w:ascii="Arial" w:hAnsi="Arial" w:cs="Arial"/>
+          <w:sz w:val="24"/>
+          <w:szCs w:val="24"/>
+        </w:rPr>
+      </w:pPr>
+    </w:p>
+    <w:p>
+      <w:pPr>
+        <w:jc w:val="both"/>
+        <w:rPr>
+          <w:rFonts w:ascii="Arial" w:hAnsi="Arial" w:cs="Arial"/>
+          <w:sz w:val="24"/>
+          <w:szCs w:val="24"/>
+        </w:rPr>
+      </w:pPr>
+      <w:r>
+        <w:rPr>
+          <w:rFonts w:ascii="Arial" w:hAnsi="Arial" w:cs="Arial"/>
+          <w:b/>
+          <w:bCs/>
+          <w:sz w:val="24"/>
+          <w:szCs w:val="24"/>
+        </w:rPr>
+        <w:t xml:space="preserve">Operadores Lógicos: </w:t>
       </w:r>
       <w:r>
         <w:rPr>
@@ -3027,7 +2575,48 @@
           <w:sz w:val="24"/>
           <w:szCs w:val="24"/>
         </w:rPr>
-        <w:t xml:space="preserve">E: </w:t>
+        <w:lastRenderedPageBreak/>
+        <w:t>E</w:t>
+      </w:r>
+      <w:r>
+        <w:rPr>
+          <w:rFonts w:ascii="Arial" w:hAnsi="Arial" w:cs="Arial"/>
+          <w:b/>
+          <w:bCs/>
+          <w:sz w:val="24"/>
+          <w:szCs w:val="24"/>
+        </w:rPr>
+        <w:t xml:space="preserve"> (Conjunção</w:t>
+      </w:r>
+      <w:r>
+        <w:rPr>
+          <w:rFonts w:ascii="Arial" w:hAnsi="Arial" w:cs="Arial"/>
+          <w:b/>
+          <w:bCs/>
+          <w:sz w:val="24"/>
+          <w:szCs w:val="24"/>
+        </w:rPr>
+        <w:t xml:space="preserve"> - Maximalista</w:t>
+      </w:r>
+      <w:r>
+        <w:rPr>
+          <w:rFonts w:ascii="Arial" w:hAnsi="Arial" w:cs="Arial"/>
+          <w:b/>
+          <w:bCs/>
+          <w:sz w:val="24"/>
+          <w:szCs w:val="24"/>
+        </w:rPr>
+        <w:t>)</w:t>
+      </w:r>
+      <w:r>
+        <w:rPr>
+          <w:rFonts w:ascii="Arial" w:hAnsi="Arial" w:cs="Arial"/>
+          <w:b/>
+          <w:bCs/>
+          <w:sz w:val="24"/>
+          <w:szCs w:val="24"/>
+        </w:rPr>
+        <w:t xml:space="preserve">: </w:t>
       </w:r>
       <w:r>
         <w:rPr>
@@ -3036,6 +2625,14 @@
           <w:szCs w:val="24"/>
         </w:rPr>
         <w:t>Só é verdadeiro quando todas as proposições forem verdadeiras.</w:t>
+      </w:r>
+      <w:r>
+        <w:rPr>
+          <w:rFonts w:ascii="Arial" w:hAnsi="Arial" w:cs="Arial"/>
+          <w:sz w:val="24"/>
+          <w:szCs w:val="24"/>
+        </w:rPr>
+        <w:t xml:space="preserve"> (&amp;&amp; em Java).</w:t>
       </w:r>
     </w:p>
     <w:p>
@@ -3060,7 +2657,27 @@
           <w:sz w:val="24"/>
           <w:szCs w:val="24"/>
         </w:rPr>
-        <w:t>OU:</w:t>
+        <w:t>OU</w:t>
+      </w:r>
+      <w:r>
+        <w:rPr>
+          <w:rFonts w:ascii="Arial" w:hAnsi="Arial" w:cs="Arial"/>
+          <w:b/>
+          <w:bCs/>
+          <w:sz w:val="24"/>
+          <w:szCs w:val="24"/>
+        </w:rPr>
+        <w:t xml:space="preserve"> (Minimalista)</w:t>
+      </w:r>
+      <w:r>
+        <w:rPr>
+          <w:rFonts w:ascii="Arial" w:hAnsi="Arial" w:cs="Arial"/>
+          <w:b/>
+          <w:bCs/>
+          <w:sz w:val="24"/>
+          <w:szCs w:val="24"/>
+        </w:rPr>
+        <w:t>:</w:t>
       </w:r>
       <w:r>
         <w:rPr>
@@ -3077,6 +2694,38 @@
           <w:szCs w:val="24"/>
         </w:rPr>
         <w:t>Só é falso quando todas as proposições forem falsas.</w:t>
+      </w:r>
+      <w:r>
+        <w:rPr>
+          <w:rFonts w:ascii="Arial" w:hAnsi="Arial" w:cs="Arial"/>
+          <w:sz w:val="24"/>
+          <w:szCs w:val="24"/>
+        </w:rPr>
+        <w:t xml:space="preserve"> </w:t>
+      </w:r>
+      <w:r>
+        <w:rPr>
+          <w:rFonts w:ascii="Arial" w:hAnsi="Arial" w:cs="Arial"/>
+          <w:sz w:val="24"/>
+          <w:szCs w:val="24"/>
+        </w:rPr>
+        <w:t>(</w:t>
+      </w:r>
+      <w:r>
+        <w:rPr>
+          <w:rFonts w:ascii="Arial" w:hAnsi="Arial" w:cs="Arial"/>
+          <w:sz w:val="24"/>
+          <w:szCs w:val="24"/>
+        </w:rPr>
+        <w:t>||</w:t>
+      </w:r>
+      <w:r>
+        <w:rPr>
+          <w:rFonts w:ascii="Arial" w:hAnsi="Arial" w:cs="Arial"/>
+          <w:sz w:val="24"/>
+          <w:szCs w:val="24"/>
+        </w:rPr>
+        <w:t xml:space="preserve"> em Java).</w:t>
       </w:r>
     </w:p>
     <w:p>
@@ -3127,38 +2776,63 @@
         </w:rPr>
         <w:t xml:space="preserve"> valores lógicos.</w:t>
       </w:r>
-    </w:p>
-    <w:p>
-      <w:pPr>
-        <w:jc w:val="both"/>
-        <w:rPr>
-          <w:rFonts w:ascii="Arial" w:hAnsi="Arial" w:cs="Arial"/>
-          <w:sz w:val="24"/>
-          <w:szCs w:val="24"/>
-        </w:rPr>
-      </w:pPr>
-    </w:p>
-    <w:p>
-      <w:pPr>
-        <w:jc w:val="both"/>
-        <w:rPr>
-          <w:rFonts w:ascii="Arial" w:hAnsi="Arial" w:cs="Arial"/>
-          <w:b/>
-          <w:bCs/>
-          <w:sz w:val="24"/>
-          <w:szCs w:val="24"/>
-        </w:rPr>
-      </w:pPr>
-      <w:r>
-        <w:rPr>
-          <w:rFonts w:ascii="Arial" w:hAnsi="Arial" w:cs="Arial"/>
-          <w:b/>
-          <w:bCs/>
-          <w:sz w:val="24"/>
-          <w:szCs w:val="24"/>
-        </w:rPr>
-        <w:lastRenderedPageBreak/>
+      <w:r>
+        <w:rPr>
+          <w:rFonts w:ascii="Arial" w:hAnsi="Arial" w:cs="Arial"/>
+          <w:sz w:val="24"/>
+          <w:szCs w:val="24"/>
+        </w:rPr>
+        <w:t xml:space="preserve"> (!)</w:t>
+      </w:r>
+    </w:p>
+    <w:p>
+      <w:pPr>
+        <w:jc w:val="both"/>
+        <w:rPr>
+          <w:rFonts w:ascii="Arial" w:hAnsi="Arial" w:cs="Arial"/>
+          <w:sz w:val="24"/>
+          <w:szCs w:val="24"/>
+        </w:rPr>
+      </w:pPr>
+    </w:p>
+    <w:p>
+      <w:pPr>
+        <w:jc w:val="both"/>
+        <w:rPr>
+          <w:rFonts w:ascii="Arial" w:hAnsi="Arial" w:cs="Arial"/>
+          <w:b/>
+          <w:bCs/>
+          <w:sz w:val="24"/>
+          <w:szCs w:val="24"/>
+        </w:rPr>
+      </w:pPr>
+      <w:r>
+        <w:rPr>
+          <w:rFonts w:ascii="Arial" w:hAnsi="Arial" w:cs="Arial"/>
+          <w:b/>
+          <w:bCs/>
+          <w:sz w:val="24"/>
+          <w:szCs w:val="24"/>
+        </w:rPr>
         <w:t>Tabelas verdade:</w:t>
+      </w:r>
+    </w:p>
+    <w:p>
+      <w:pPr>
+        <w:jc w:val="both"/>
+        <w:rPr>
+          <w:rFonts w:ascii="Arial" w:hAnsi="Arial" w:cs="Arial"/>
+          <w:sz w:val="24"/>
+          <w:szCs w:val="24"/>
+        </w:rPr>
+      </w:pPr>
+      <w:r>
+        <w:rPr>
+          <w:rFonts w:ascii="Arial" w:hAnsi="Arial" w:cs="Arial"/>
+          <w:sz w:val="24"/>
+          <w:szCs w:val="24"/>
+        </w:rPr>
+        <w:t>Paula e Quéssia estão felizes.</w:t>
       </w:r>
     </w:p>
     <w:tbl>
@@ -3556,12 +3230,18 @@
         <w:jc w:val="both"/>
         <w:rPr>
           <w:rFonts w:ascii="Arial" w:hAnsi="Arial" w:cs="Arial"/>
-          <w:b/>
-          <w:bCs/>
-          <w:sz w:val="24"/>
-          <w:szCs w:val="24"/>
-        </w:rPr>
-      </w:pPr>
+          <w:sz w:val="24"/>
+          <w:szCs w:val="24"/>
+        </w:rPr>
+      </w:pPr>
+      <w:r>
+        <w:rPr>
+          <w:rFonts w:ascii="Arial" w:hAnsi="Arial" w:cs="Arial"/>
+          <w:sz w:val="24"/>
+          <w:szCs w:val="24"/>
+        </w:rPr>
+        <w:t>Paula ou Quésia estão felizes.</w:t>
+      </w:r>
     </w:p>
     <w:tbl>
       <w:tblPr>
@@ -3663,27 +3343,7 @@
                 <w:sz w:val="24"/>
                 <w:szCs w:val="24"/>
               </w:rPr>
-              <w:t xml:space="preserve">p </w:t>
-            </w:r>
-            <w:r>
-              <w:rPr>
-                <w:rFonts w:ascii="Arial" w:hAnsi="Arial" w:cs="Arial"/>
-                <w:b/>
-                <w:bCs/>
-                <w:sz w:val="24"/>
-                <w:szCs w:val="24"/>
-              </w:rPr>
-              <w:t>OU</w:t>
-            </w:r>
-            <w:r>
-              <w:rPr>
-                <w:rFonts w:ascii="Arial" w:hAnsi="Arial" w:cs="Arial"/>
-                <w:b/>
-                <w:bCs/>
-                <w:sz w:val="24"/>
-                <w:szCs w:val="24"/>
-              </w:rPr>
-              <w:t xml:space="preserve"> q</w:t>
+              <w:t>p OU q</w:t>
             </w:r>
           </w:p>
         </w:tc>
@@ -4085,27 +3745,7 @@
                 <w:sz w:val="24"/>
                 <w:szCs w:val="24"/>
               </w:rPr>
-              <w:t xml:space="preserve">p </w:t>
-            </w:r>
-            <w:r>
-              <w:rPr>
-                <w:rFonts w:ascii="Arial" w:hAnsi="Arial" w:cs="Arial"/>
-                <w:b/>
-                <w:bCs/>
-                <w:sz w:val="24"/>
-                <w:szCs w:val="24"/>
-              </w:rPr>
-              <w:t>SE, ENTÃO</w:t>
-            </w:r>
-            <w:r>
-              <w:rPr>
-                <w:rFonts w:ascii="Arial" w:hAnsi="Arial" w:cs="Arial"/>
-                <w:b/>
-                <w:bCs/>
-                <w:sz w:val="24"/>
-                <w:szCs w:val="24"/>
-              </w:rPr>
-              <w:t xml:space="preserve"> q</w:t>
+              <w:t>p SE, ENTÃO q</w:t>
             </w:r>
           </w:p>
         </w:tc>
@@ -4569,27 +4209,7 @@
                 <w:sz w:val="24"/>
                 <w:szCs w:val="24"/>
               </w:rPr>
-              <w:t xml:space="preserve">p </w:t>
-            </w:r>
-            <w:r>
-              <w:rPr>
-                <w:rFonts w:ascii="Arial" w:hAnsi="Arial" w:cs="Arial"/>
-                <w:b/>
-                <w:bCs/>
-                <w:sz w:val="24"/>
-                <w:szCs w:val="24"/>
-              </w:rPr>
-              <w:t>OU, OU</w:t>
-            </w:r>
-            <w:r>
-              <w:rPr>
-                <w:rFonts w:ascii="Arial" w:hAnsi="Arial" w:cs="Arial"/>
-                <w:b/>
-                <w:bCs/>
-                <w:sz w:val="24"/>
-                <w:szCs w:val="24"/>
-              </w:rPr>
-              <w:t xml:space="preserve"> q</w:t>
+              <w:t>p OU, OU q</w:t>
             </w:r>
           </w:p>
         </w:tc>
@@ -5008,42 +4628,6 @@
         <w:jc w:val="both"/>
         <w:rPr>
           <w:rFonts w:ascii="Arial" w:hAnsi="Arial" w:cs="Arial"/>
-          <w:b/>
-          <w:bCs/>
-          <w:sz w:val="24"/>
-          <w:szCs w:val="24"/>
-        </w:rPr>
-      </w:pPr>
-    </w:p>
-    <w:p>
-      <w:pPr>
-        <w:jc w:val="both"/>
-        <w:rPr>
-          <w:rFonts w:ascii="Arial" w:hAnsi="Arial" w:cs="Arial"/>
-          <w:b/>
-          <w:bCs/>
-          <w:sz w:val="24"/>
-          <w:szCs w:val="24"/>
-        </w:rPr>
-      </w:pPr>
-    </w:p>
-    <w:p>
-      <w:pPr>
-        <w:jc w:val="both"/>
-        <w:rPr>
-          <w:rFonts w:ascii="Arial" w:hAnsi="Arial" w:cs="Arial"/>
-          <w:b/>
-          <w:bCs/>
-          <w:sz w:val="24"/>
-          <w:szCs w:val="24"/>
-        </w:rPr>
-      </w:pPr>
-    </w:p>
-    <w:p>
-      <w:pPr>
-        <w:jc w:val="both"/>
-        <w:rPr>
-          <w:rFonts w:ascii="Arial" w:hAnsi="Arial" w:cs="Arial"/>
           <w:sz w:val="24"/>
           <w:szCs w:val="24"/>
         </w:rPr>
@@ -5088,7 +4672,904 @@
             <w:sz w:val="24"/>
             <w:szCs w:val="24"/>
           </w:rPr>
-          <w:t>https://www.youtu</w:t>
+          <w:t>https://www.youtube.com/watch?v=2l1Hz3U_yx0</w:t>
+        </w:r>
+      </w:hyperlink>
+      <w:r>
+        <w:rPr>
+          <w:rFonts w:ascii="Arial" w:hAnsi="Arial" w:cs="Arial"/>
+          <w:b/>
+          <w:bCs/>
+          <w:sz w:val="24"/>
+          <w:szCs w:val="24"/>
+        </w:rPr>
+        <w:t xml:space="preserve">  (</w:t>
+      </w:r>
+      <w:r>
+        <w:rPr>
+          <w:rFonts w:ascii="Arial" w:hAnsi="Arial" w:cs="Arial"/>
+          <w:sz w:val="24"/>
+          <w:szCs w:val="24"/>
+        </w:rPr>
+        <w:t>Cataline – Lógica de programação 08 – Operadores lógicos).</w:t>
+      </w:r>
+    </w:p>
+    <w:p>
+      <w:pPr>
+        <w:jc w:val="both"/>
+        <w:rPr>
+          <w:rFonts w:ascii="Arial" w:hAnsi="Arial" w:cs="Arial"/>
+          <w:sz w:val="24"/>
+          <w:szCs w:val="24"/>
+        </w:rPr>
+      </w:pPr>
+      <w:r>
+        <w:rPr>
+          <w:rFonts w:ascii="Arial" w:hAnsi="Arial" w:cs="Arial"/>
+          <w:b/>
+          <w:bCs/>
+          <w:sz w:val="24"/>
+          <w:szCs w:val="24"/>
+        </w:rPr>
+        <w:sym w:font="Wingdings" w:char="F0E0"/>
+      </w:r>
+      <w:r>
+        <w:rPr>
+          <w:rFonts w:ascii="Arial" w:hAnsi="Arial" w:cs="Arial"/>
+          <w:b/>
+          <w:bCs/>
+          <w:sz w:val="24"/>
+          <w:szCs w:val="24"/>
+        </w:rPr>
+        <w:t xml:space="preserve"> </w:t>
+      </w:r>
+      <w:hyperlink r:id="rId14" w:history="1">
+        <w:r>
+          <w:rPr>
+            <w:rStyle w:val="Hyperlink"/>
+            <w:rFonts w:ascii="Arial" w:hAnsi="Arial" w:cs="Arial"/>
+            <w:b/>
+            <w:bCs/>
+            <w:sz w:val="24"/>
+            <w:szCs w:val="24"/>
+            <w:highlight w:val="yellow"/>
+          </w:rPr>
+          <w:t>https://www.youtube.com/watch?v=ntCQmyfhA30</w:t>
+        </w:r>
+      </w:hyperlink>
+      <w:r>
+        <w:rPr>
+          <w:rFonts w:ascii="Arial" w:hAnsi="Arial" w:cs="Arial"/>
+          <w:b/>
+          <w:bCs/>
+          <w:sz w:val="24"/>
+          <w:szCs w:val="24"/>
+        </w:rPr>
+        <w:t xml:space="preserve"> </w:t>
+      </w:r>
+      <w:r>
+        <w:rPr>
+          <w:rFonts w:ascii="Arial" w:hAnsi="Arial" w:cs="Arial"/>
+          <w:b/>
+          <w:bCs/>
+          <w:sz w:val="24"/>
+          <w:szCs w:val="24"/>
+        </w:rPr>
+        <w:t xml:space="preserve">  (</w:t>
+      </w:r>
+      <w:r>
+        <w:rPr>
+          <w:rFonts w:ascii="Arial" w:hAnsi="Arial" w:cs="Arial"/>
+          <w:sz w:val="24"/>
+          <w:szCs w:val="24"/>
+        </w:rPr>
+        <w:t>Youtube</w:t>
+      </w:r>
+      <w:r>
+        <w:rPr>
+          <w:rFonts w:ascii="Arial" w:hAnsi="Arial" w:cs="Arial"/>
+          <w:sz w:val="24"/>
+          <w:szCs w:val="24"/>
+        </w:rPr>
+        <w:t xml:space="preserve"> – </w:t>
+      </w:r>
+      <w:r>
+        <w:rPr>
+          <w:rFonts w:ascii="Arial" w:hAnsi="Arial" w:cs="Arial"/>
+          <w:sz w:val="24"/>
+          <w:szCs w:val="24"/>
+        </w:rPr>
+        <w:t>Informática módulo 1 agenda 11 operadores aritméticos, relacionais e lógicos</w:t>
+      </w:r>
+      <w:r>
+        <w:rPr>
+          <w:rFonts w:ascii="Arial" w:hAnsi="Arial" w:cs="Arial"/>
+          <w:sz w:val="24"/>
+          <w:szCs w:val="24"/>
+        </w:rPr>
+        <w:t xml:space="preserve"> – </w:t>
+      </w:r>
+      <w:r>
+        <w:rPr>
+          <w:rFonts w:ascii="Arial" w:hAnsi="Arial" w:cs="Arial"/>
+          <w:sz w:val="24"/>
+          <w:szCs w:val="24"/>
+        </w:rPr>
+        <w:t>GEEaD</w:t>
+      </w:r>
+      <w:r>
+        <w:rPr>
+          <w:rFonts w:ascii="Arial" w:hAnsi="Arial" w:cs="Arial"/>
+          <w:sz w:val="24"/>
+          <w:szCs w:val="24"/>
+        </w:rPr>
+        <w:t>).</w:t>
+      </w:r>
+    </w:p>
+    <w:p>
+      <w:pPr>
+        <w:jc w:val="both"/>
+        <w:rPr>
+          <w:rFonts w:ascii="Arial" w:hAnsi="Arial" w:cs="Arial"/>
+          <w:sz w:val="24"/>
+          <w:szCs w:val="24"/>
+        </w:rPr>
+      </w:pPr>
+    </w:p>
+    <w:p>
+      <w:pPr>
+        <w:jc w:val="both"/>
+        <w:rPr>
+          <w:rFonts w:ascii="Arial" w:hAnsi="Arial" w:cs="Arial"/>
+          <w:sz w:val="24"/>
+          <w:szCs w:val="24"/>
+        </w:rPr>
+      </w:pPr>
+    </w:p>
+    <w:p>
+      <w:pPr>
+        <w:jc w:val="both"/>
+        <w:rPr>
+          <w:rFonts w:ascii="Arial" w:hAnsi="Arial" w:cs="Arial"/>
+          <w:sz w:val="24"/>
+          <w:szCs w:val="24"/>
+        </w:rPr>
+      </w:pPr>
+    </w:p>
+    <w:p>
+      <w:pPr>
+        <w:jc w:val="both"/>
+        <w:rPr>
+          <w:rFonts w:ascii="Arial" w:hAnsi="Arial" w:cs="Arial"/>
+          <w:b/>
+          <w:bCs/>
+          <w:sz w:val="24"/>
+          <w:szCs w:val="24"/>
+        </w:rPr>
+      </w:pPr>
+    </w:p>
+    <w:p>
+      <w:pPr>
+        <w:jc w:val="both"/>
+        <w:rPr>
+          <w:rFonts w:ascii="Arial" w:hAnsi="Arial" w:cs="Arial"/>
+          <w:b/>
+          <w:bCs/>
+          <w:sz w:val="24"/>
+          <w:szCs w:val="24"/>
+        </w:rPr>
+      </w:pPr>
+    </w:p>
+    <w:p>
+      <w:pPr>
+        <w:jc w:val="both"/>
+        <w:rPr>
+          <w:rFonts w:ascii="Arial" w:hAnsi="Arial" w:cs="Arial"/>
+          <w:b/>
+          <w:bCs/>
+          <w:sz w:val="24"/>
+          <w:szCs w:val="24"/>
+        </w:rPr>
+      </w:pPr>
+      <w:r>
+        <w:rPr>
+          <w:rFonts w:ascii="Arial" w:hAnsi="Arial" w:cs="Arial"/>
+          <w:b/>
+          <w:bCs/>
+          <w:sz w:val="24"/>
+          <w:szCs w:val="24"/>
+        </w:rPr>
+        <w:lastRenderedPageBreak/>
+        <w:drawing>
+          <wp:anchor distT="0" distB="0" distL="114300" distR="114300" simplePos="0" relativeHeight="251662336" behindDoc="1" locked="0" layoutInCell="1" allowOverlap="1" wp14:anchorId="3BDB888B" wp14:editId="6AB9D036">
+            <wp:simplePos x="0" y="0"/>
+            <wp:positionH relativeFrom="column">
+              <wp:posOffset>0</wp:posOffset>
+            </wp:positionH>
+            <wp:positionV relativeFrom="paragraph">
+              <wp:posOffset>2540</wp:posOffset>
+            </wp:positionV>
+            <wp:extent cx="2825370" cy="2838450"/>
+            <wp:effectExtent l="0" t="0" r="0" b="0"/>
+            <wp:wrapTight wrapText="bothSides">
+              <wp:wrapPolygon edited="0">
+                <wp:start x="0" y="0"/>
+                <wp:lineTo x="0" y="21455"/>
+                <wp:lineTo x="21411" y="21455"/>
+                <wp:lineTo x="21411" y="0"/>
+                <wp:lineTo x="0" y="0"/>
+              </wp:wrapPolygon>
+            </wp:wrapTight>
+            <wp:docPr id="5" name="Imagem 5"/>
+            <wp:cNvGraphicFramePr>
+              <a:graphicFrameLocks xmlns:a="http://schemas.openxmlformats.org/drawingml/2006/main" noChangeAspect="1"/>
+            </wp:cNvGraphicFramePr>
+            <a:graphic xmlns:a="http://schemas.openxmlformats.org/drawingml/2006/main">
+              <a:graphicData uri="http://schemas.openxmlformats.org/drawingml/2006/picture">
+                <pic:pic xmlns:pic="http://schemas.openxmlformats.org/drawingml/2006/picture">
+                  <pic:nvPicPr>
+                    <pic:cNvPr id="1" name=""/>
+                    <pic:cNvPicPr/>
+                  </pic:nvPicPr>
+                  <pic:blipFill>
+                    <a:blip r:embed="rId15">
+                      <a:extLst>
+                        <a:ext uri="{28A0092B-C50C-407E-A947-70E740481C1C}">
+                          <a14:useLocalDpi xmlns:a14="http://schemas.microsoft.com/office/drawing/2010/main" val="0"/>
+                        </a:ext>
+                      </a:extLst>
+                    </a:blip>
+                    <a:stretch>
+                      <a:fillRect/>
+                    </a:stretch>
+                  </pic:blipFill>
+                  <pic:spPr>
+                    <a:xfrm>
+                      <a:off x="0" y="0"/>
+                      <a:ext cx="2825370" cy="2838450"/>
+                    </a:xfrm>
+                    <a:prstGeom prst="rect">
+                      <a:avLst/>
+                    </a:prstGeom>
+                  </pic:spPr>
+                </pic:pic>
+              </a:graphicData>
+            </a:graphic>
+          </wp:anchor>
+        </w:drawing>
+      </w:r>
+    </w:p>
+    <w:p>
+      <w:pPr>
+        <w:jc w:val="both"/>
+        <w:rPr>
+          <w:rFonts w:ascii="Arial" w:hAnsi="Arial" w:cs="Arial"/>
+          <w:b/>
+          <w:bCs/>
+          <w:sz w:val="24"/>
+          <w:szCs w:val="24"/>
+        </w:rPr>
+      </w:pPr>
+      <w:r>
+        <w:rPr>
+          <w:rFonts w:ascii="Arial" w:hAnsi="Arial" w:cs="Arial"/>
+          <w:b/>
+          <w:bCs/>
+          <w:sz w:val="24"/>
+          <w:szCs w:val="24"/>
+        </w:rPr>
+        <w:t>Por quê entender lógica de programação?</w:t>
+      </w:r>
+    </w:p>
+    <w:p>
+      <w:pPr>
+        <w:jc w:val="both"/>
+        <w:rPr>
+          <w:rFonts w:ascii="Arial" w:hAnsi="Arial" w:cs="Arial"/>
+          <w:sz w:val="24"/>
+          <w:szCs w:val="24"/>
+        </w:rPr>
+      </w:pPr>
+      <w:r>
+        <w:rPr>
+          <w:rFonts w:ascii="Arial" w:hAnsi="Arial" w:cs="Arial"/>
+          <w:sz w:val="24"/>
+          <w:szCs w:val="24"/>
+        </w:rPr>
+        <w:tab/>
+        <w:t xml:space="preserve">Lógica de programação é o processo de pensar na mesma </w:t>
+      </w:r>
+      <w:r>
+        <w:rPr>
+          <w:rFonts w:ascii="Arial" w:hAnsi="Arial" w:cs="Arial"/>
+          <w:b/>
+          <w:bCs/>
+          <w:sz w:val="24"/>
+          <w:szCs w:val="24"/>
+        </w:rPr>
+        <w:t xml:space="preserve">sequência </w:t>
+      </w:r>
+      <w:r>
+        <w:rPr>
+          <w:rFonts w:ascii="Arial" w:hAnsi="Arial" w:cs="Arial"/>
+          <w:sz w:val="24"/>
+          <w:szCs w:val="24"/>
+        </w:rPr>
+        <w:t xml:space="preserve">em que o computador executa as tarefas. </w:t>
+      </w:r>
+    </w:p>
+    <w:p>
+      <w:pPr>
+        <w:jc w:val="both"/>
+        <w:rPr>
+          <w:rFonts w:ascii="Arial" w:hAnsi="Arial" w:cs="Arial"/>
+          <w:sz w:val="24"/>
+          <w:szCs w:val="24"/>
+        </w:rPr>
+      </w:pPr>
+      <w:r>
+        <w:rPr>
+          <w:rFonts w:ascii="Arial" w:hAnsi="Arial" w:cs="Arial"/>
+          <w:sz w:val="24"/>
+          <w:szCs w:val="24"/>
+        </w:rPr>
+        <w:tab/>
+      </w:r>
+      <w:r>
+        <w:rPr>
+          <w:rFonts w:ascii="Arial" w:hAnsi="Arial" w:cs="Arial"/>
+          <w:b/>
+          <w:bCs/>
+          <w:sz w:val="24"/>
+          <w:szCs w:val="24"/>
+        </w:rPr>
+        <w:t>Algoritmo</w:t>
+      </w:r>
+      <w:r>
+        <w:rPr>
+          <w:rFonts w:ascii="Arial" w:hAnsi="Arial" w:cs="Arial"/>
+          <w:sz w:val="24"/>
+          <w:szCs w:val="24"/>
+        </w:rPr>
+        <w:t xml:space="preserve"> – sequência finita de passos que levam a execução de uma tarefa.</w:t>
+      </w:r>
+      <w:r>
+        <w:rPr>
+          <w:rFonts w:ascii="Arial" w:hAnsi="Arial" w:cs="Arial"/>
+          <w:sz w:val="24"/>
+          <w:szCs w:val="24"/>
+        </w:rPr>
+        <w:t xml:space="preserve"> É a planta da casa (ideia, projeto).</w:t>
+      </w:r>
+      <w:r>
+        <w:rPr>
+          <w:rFonts w:ascii="Arial" w:hAnsi="Arial" w:cs="Arial"/>
+          <w:sz w:val="24"/>
+          <w:szCs w:val="24"/>
+        </w:rPr>
+        <w:t xml:space="preserve"> Inicialmente </w:t>
+      </w:r>
+    </w:p>
+    <w:p>
+      <w:pPr>
+        <w:jc w:val="both"/>
+        <w:rPr>
+          <w:rFonts w:ascii="Arial" w:hAnsi="Arial" w:cs="Arial"/>
+          <w:sz w:val="24"/>
+          <w:szCs w:val="24"/>
+        </w:rPr>
+      </w:pPr>
+      <w:r>
+        <w:rPr>
+          <w:rFonts w:ascii="Arial" w:hAnsi="Arial" w:cs="Arial"/>
+          <w:sz w:val="24"/>
+          <w:szCs w:val="24"/>
+        </w:rPr>
+        <w:tab/>
+      </w:r>
+      <w:r>
+        <w:rPr>
+          <w:rFonts w:ascii="Arial" w:hAnsi="Arial" w:cs="Arial"/>
+          <w:b/>
+          <w:bCs/>
+          <w:sz w:val="24"/>
+          <w:szCs w:val="24"/>
+        </w:rPr>
+        <w:t>Programa de computador</w:t>
+      </w:r>
+      <w:r>
+        <w:rPr>
+          <w:rFonts w:ascii="Arial" w:hAnsi="Arial" w:cs="Arial"/>
+          <w:sz w:val="24"/>
+          <w:szCs w:val="24"/>
+        </w:rPr>
+        <w:t xml:space="preserve"> – são algoritmos escritos em uma linguagem de programação.</w:t>
+      </w:r>
+    </w:p>
+    <w:p>
+      <w:pPr>
+        <w:jc w:val="both"/>
+        <w:rPr>
+          <w:rFonts w:ascii="Arial" w:hAnsi="Arial" w:cs="Arial"/>
+          <w:sz w:val="24"/>
+          <w:szCs w:val="24"/>
+        </w:rPr>
+      </w:pPr>
+      <w:r>
+        <w:rPr>
+          <w:rFonts w:ascii="Arial" w:hAnsi="Arial" w:cs="Arial"/>
+          <w:sz w:val="24"/>
+          <w:szCs w:val="24"/>
+        </w:rPr>
+        <w:tab/>
+        <w:t>Ordenação do pensamento</w:t>
+      </w:r>
+      <w:r>
+        <w:rPr>
+          <w:rFonts w:ascii="Arial" w:hAnsi="Arial" w:cs="Arial"/>
+          <w:sz w:val="24"/>
+          <w:szCs w:val="24"/>
+        </w:rPr>
+        <w:t xml:space="preserve"> para estruturação da lógica.</w:t>
+      </w:r>
+    </w:p>
+    <w:p>
+      <w:pPr>
+        <w:jc w:val="both"/>
+        <w:rPr>
+          <w:rFonts w:ascii="Arial" w:hAnsi="Arial" w:cs="Arial"/>
+          <w:b/>
+          <w:bCs/>
+          <w:sz w:val="24"/>
+          <w:szCs w:val="24"/>
+        </w:rPr>
+      </w:pPr>
+      <w:r>
+        <w:rPr>
+          <w:rFonts w:ascii="Arial" w:hAnsi="Arial" w:cs="Arial"/>
+          <w:b/>
+          <w:bCs/>
+          <w:sz w:val="24"/>
+          <w:szCs w:val="24"/>
+          <w:highlight w:val="yellow"/>
+        </w:rPr>
+        <w:t>IMPORTANTE</w:t>
+      </w:r>
+      <w:r>
+        <w:rPr>
+          <w:rFonts w:ascii="Arial" w:hAnsi="Arial" w:cs="Arial"/>
+          <w:b/>
+          <w:bCs/>
+          <w:sz w:val="24"/>
+          <w:szCs w:val="24"/>
+          <w:highlight w:val="yellow"/>
+        </w:rPr>
+        <w:t xml:space="preserve"> (PARA DESENVOLVEDOR)</w:t>
+      </w:r>
+      <w:r>
+        <w:rPr>
+          <w:rFonts w:ascii="Arial" w:hAnsi="Arial" w:cs="Arial"/>
+          <w:b/>
+          <w:bCs/>
+          <w:sz w:val="24"/>
+          <w:szCs w:val="24"/>
+          <w:highlight w:val="yellow"/>
+        </w:rPr>
+        <w:t>:</w:t>
+      </w:r>
+      <w:r>
+        <w:rPr>
+          <w:rFonts w:ascii="Arial" w:hAnsi="Arial" w:cs="Arial"/>
+          <w:b/>
+          <w:bCs/>
+          <w:sz w:val="24"/>
+          <w:szCs w:val="24"/>
+        </w:rPr>
+        <w:t xml:space="preserve"> </w:t>
+      </w:r>
+      <w:r>
+        <w:rPr>
+          <w:rFonts w:ascii="Arial" w:hAnsi="Arial" w:cs="Arial"/>
+          <w:sz w:val="24"/>
+          <w:szCs w:val="24"/>
+        </w:rPr>
+        <w:t xml:space="preserve">Toda vez que pensar em </w:t>
+      </w:r>
+      <w:r>
+        <w:rPr>
+          <w:rFonts w:ascii="Arial" w:hAnsi="Arial" w:cs="Arial"/>
+          <w:b/>
+          <w:bCs/>
+          <w:sz w:val="24"/>
+          <w:szCs w:val="24"/>
+        </w:rPr>
+        <w:t xml:space="preserve">algoritmo </w:t>
+      </w:r>
+      <w:r>
+        <w:rPr>
+          <w:rFonts w:ascii="Arial" w:hAnsi="Arial" w:cs="Arial"/>
+          <w:sz w:val="24"/>
+          <w:szCs w:val="24"/>
+        </w:rPr>
+        <w:t xml:space="preserve">ou pensar em </w:t>
+      </w:r>
+      <w:r>
+        <w:rPr>
+          <w:rFonts w:ascii="Arial" w:hAnsi="Arial" w:cs="Arial"/>
+          <w:b/>
+          <w:bCs/>
+          <w:sz w:val="24"/>
+          <w:szCs w:val="24"/>
+        </w:rPr>
+        <w:t xml:space="preserve">programação </w:t>
+      </w:r>
+      <w:r>
+        <w:rPr>
+          <w:rFonts w:ascii="Arial" w:hAnsi="Arial" w:cs="Arial"/>
+          <w:sz w:val="24"/>
+          <w:szCs w:val="24"/>
+        </w:rPr>
+        <w:t xml:space="preserve">tem que se pensar em </w:t>
+      </w:r>
+      <w:r>
+        <w:rPr>
+          <w:rFonts w:ascii="Arial" w:hAnsi="Arial" w:cs="Arial"/>
+          <w:b/>
+          <w:bCs/>
+          <w:sz w:val="24"/>
+          <w:szCs w:val="24"/>
+        </w:rPr>
+        <w:t>Entrada</w:t>
+      </w:r>
+      <w:r>
+        <w:rPr>
+          <w:rFonts w:ascii="Arial" w:hAnsi="Arial" w:cs="Arial"/>
+          <w:b/>
+          <w:bCs/>
+          <w:sz w:val="24"/>
+          <w:szCs w:val="24"/>
+        </w:rPr>
+        <w:t xml:space="preserve"> </w:t>
+      </w:r>
+      <w:r>
+        <w:rPr>
+          <w:rFonts w:ascii="Arial" w:hAnsi="Arial" w:cs="Arial"/>
+          <w:sz w:val="24"/>
+          <w:szCs w:val="24"/>
+        </w:rPr>
+        <w:t>(variáveis, constantes, Arrays)</w:t>
+      </w:r>
+      <w:r>
+        <w:rPr>
+          <w:rFonts w:ascii="Arial" w:hAnsi="Arial" w:cs="Arial"/>
+          <w:b/>
+          <w:bCs/>
+          <w:sz w:val="24"/>
+          <w:szCs w:val="24"/>
+        </w:rPr>
+        <w:t xml:space="preserve"> &gt; Processamento</w:t>
+      </w:r>
+      <w:r>
+        <w:rPr>
+          <w:rFonts w:ascii="Arial" w:hAnsi="Arial" w:cs="Arial"/>
+          <w:b/>
+          <w:bCs/>
+          <w:sz w:val="24"/>
+          <w:szCs w:val="24"/>
+        </w:rPr>
+        <w:t xml:space="preserve"> </w:t>
+      </w:r>
+      <w:r>
+        <w:rPr>
+          <w:rFonts w:ascii="Arial" w:hAnsi="Arial" w:cs="Arial"/>
+          <w:sz w:val="24"/>
+          <w:szCs w:val="24"/>
+        </w:rPr>
+        <w:t>(operadores aritméticos, relacionais, atribuição e lógicos)</w:t>
+      </w:r>
+      <w:r>
+        <w:rPr>
+          <w:rFonts w:ascii="Arial" w:hAnsi="Arial" w:cs="Arial"/>
+          <w:b/>
+          <w:bCs/>
+          <w:sz w:val="24"/>
+          <w:szCs w:val="24"/>
+        </w:rPr>
+        <w:t xml:space="preserve"> &gt; Saída.</w:t>
+      </w:r>
+    </w:p>
+    <w:p>
+      <w:pPr>
+        <w:jc w:val="both"/>
+        <w:rPr>
+          <w:rFonts w:ascii="Arial" w:hAnsi="Arial" w:cs="Arial"/>
+          <w:sz w:val="24"/>
+          <w:szCs w:val="24"/>
+        </w:rPr>
+      </w:pPr>
+      <w:r>
+        <w:rPr>
+          <w:rFonts w:ascii="Arial" w:hAnsi="Arial" w:cs="Arial"/>
+          <w:b/>
+          <w:bCs/>
+          <w:sz w:val="24"/>
+          <w:szCs w:val="24"/>
+        </w:rPr>
+        <w:t xml:space="preserve">Como começar a planejar um algoritmo – </w:t>
+      </w:r>
+      <w:r>
+        <w:rPr>
+          <w:rFonts w:ascii="Arial" w:hAnsi="Arial" w:cs="Arial"/>
+          <w:sz w:val="24"/>
+          <w:szCs w:val="24"/>
+        </w:rPr>
+        <w:t>Narrativa (descrição) &gt; Fluxograma (representação gráfica) &gt; Pseudocódigo.</w:t>
+      </w:r>
+    </w:p>
+    <w:p>
+      <w:pPr>
+        <w:jc w:val="both"/>
+        <w:rPr>
+          <w:rFonts w:ascii="Arial" w:hAnsi="Arial" w:cs="Arial"/>
+          <w:sz w:val="24"/>
+          <w:szCs w:val="24"/>
+        </w:rPr>
+      </w:pPr>
+      <w:r>
+        <w:rPr>
+          <w:rFonts w:ascii="Arial" w:hAnsi="Arial" w:cs="Arial"/>
+          <w:b/>
+          <w:bCs/>
+          <w:sz w:val="24"/>
+          <w:szCs w:val="24"/>
+        </w:rPr>
+        <w:sym w:font="Wingdings" w:char="F0E0"/>
+      </w:r>
+      <w:r>
+        <w:rPr>
+          <w:rFonts w:ascii="Arial" w:hAnsi="Arial" w:cs="Arial"/>
+          <w:b/>
+          <w:bCs/>
+          <w:sz w:val="24"/>
+          <w:szCs w:val="24"/>
+        </w:rPr>
+        <w:t xml:space="preserve"> </w:t>
+      </w:r>
+      <w:hyperlink r:id="rId16" w:history="1">
+        <w:r>
+          <w:rPr>
+            <w:rStyle w:val="Hyperlink"/>
+            <w:rFonts w:ascii="Arial" w:hAnsi="Arial" w:cs="Arial"/>
+            <w:b/>
+            <w:bCs/>
+            <w:sz w:val="24"/>
+            <w:szCs w:val="24"/>
+            <w:highlight w:val="yellow"/>
+          </w:rPr>
+          <w:t>https://www.youtube.com/watch?v=WTQi</w:t>
+        </w:r>
+        <w:r>
+          <w:rPr>
+            <w:rStyle w:val="Hyperlink"/>
+            <w:rFonts w:ascii="Arial" w:hAnsi="Arial" w:cs="Arial"/>
+            <w:b/>
+            <w:bCs/>
+            <w:sz w:val="24"/>
+            <w:szCs w:val="24"/>
+            <w:highlight w:val="yellow"/>
+          </w:rPr>
+          <w:t>Z</w:t>
+        </w:r>
+        <w:r>
+          <w:rPr>
+            <w:rStyle w:val="Hyperlink"/>
+            <w:rFonts w:ascii="Arial" w:hAnsi="Arial" w:cs="Arial"/>
+            <w:b/>
+            <w:bCs/>
+            <w:sz w:val="24"/>
+            <w:szCs w:val="24"/>
+            <w:highlight w:val="yellow"/>
+          </w:rPr>
+          <w:t>4zyIJw</w:t>
+        </w:r>
+      </w:hyperlink>
+      <w:r>
+        <w:rPr>
+          <w:rFonts w:ascii="Arial" w:hAnsi="Arial" w:cs="Arial"/>
+          <w:b/>
+          <w:bCs/>
+          <w:sz w:val="24"/>
+          <w:szCs w:val="24"/>
+        </w:rPr>
+        <w:t xml:space="preserve"> </w:t>
+      </w:r>
+      <w:r>
+        <w:rPr>
+          <w:rFonts w:ascii="Arial" w:hAnsi="Arial" w:cs="Arial"/>
+          <w:b/>
+          <w:bCs/>
+          <w:sz w:val="24"/>
+          <w:szCs w:val="24"/>
+        </w:rPr>
+        <w:t xml:space="preserve"> (</w:t>
+      </w:r>
+      <w:r>
+        <w:rPr>
+          <w:rFonts w:ascii="Arial" w:hAnsi="Arial" w:cs="Arial"/>
+          <w:sz w:val="24"/>
+          <w:szCs w:val="24"/>
+        </w:rPr>
+        <w:t xml:space="preserve">Youtube – </w:t>
+      </w:r>
+      <w:r>
+        <w:rPr>
+          <w:rFonts w:ascii="Arial" w:hAnsi="Arial" w:cs="Arial"/>
+          <w:sz w:val="24"/>
+          <w:szCs w:val="24"/>
+        </w:rPr>
+        <w:t>Agenda 02 DS- Módulo 1</w:t>
+      </w:r>
+      <w:r>
+        <w:rPr>
+          <w:rFonts w:ascii="Arial" w:hAnsi="Arial" w:cs="Arial"/>
+          <w:sz w:val="24"/>
+          <w:szCs w:val="24"/>
+        </w:rPr>
+        <w:t xml:space="preserve"> – GEEaD).</w:t>
+      </w:r>
+    </w:p>
+    <w:p>
+      <w:pPr>
+        <w:jc w:val="both"/>
+        <w:rPr>
+          <w:rFonts w:ascii="Arial" w:hAnsi="Arial" w:cs="Arial"/>
+          <w:sz w:val="24"/>
+          <w:szCs w:val="24"/>
+        </w:rPr>
+      </w:pPr>
+      <w:r>
+        <w:rPr>
+          <w:rFonts w:ascii="Arial" w:hAnsi="Arial" w:cs="Arial"/>
+          <w:b/>
+          <w:bCs/>
+          <w:sz w:val="24"/>
+          <w:szCs w:val="24"/>
+        </w:rPr>
+        <w:sym w:font="Wingdings" w:char="F0E0"/>
+      </w:r>
+      <w:r>
+        <w:rPr>
+          <w:rFonts w:ascii="Arial" w:hAnsi="Arial" w:cs="Arial"/>
+          <w:b/>
+          <w:bCs/>
+          <w:sz w:val="24"/>
+          <w:szCs w:val="24"/>
+        </w:rPr>
+        <w:t xml:space="preserve"> </w:t>
+      </w:r>
+      <w:hyperlink r:id="rId17" w:history="1">
+        <w:r>
+          <w:rPr>
+            <w:rStyle w:val="Hyperlink"/>
+            <w:rFonts w:ascii="Arial" w:hAnsi="Arial" w:cs="Arial"/>
+            <w:b/>
+            <w:bCs/>
+            <w:sz w:val="24"/>
+            <w:szCs w:val="24"/>
+            <w:highlight w:val="yellow"/>
+          </w:rPr>
+          <w:t>https://www.youtube.com/watch?v=aYYpwb7z</w:t>
+        </w:r>
+        <w:r>
+          <w:rPr>
+            <w:rStyle w:val="Hyperlink"/>
+            <w:rFonts w:ascii="Arial" w:hAnsi="Arial" w:cs="Arial"/>
+            <w:b/>
+            <w:bCs/>
+            <w:sz w:val="24"/>
+            <w:szCs w:val="24"/>
+            <w:highlight w:val="yellow"/>
+          </w:rPr>
+          <w:t>A</w:t>
+        </w:r>
+        <w:r>
+          <w:rPr>
+            <w:rStyle w:val="Hyperlink"/>
+            <w:rFonts w:ascii="Arial" w:hAnsi="Arial" w:cs="Arial"/>
+            <w:b/>
+            <w:bCs/>
+            <w:sz w:val="24"/>
+            <w:szCs w:val="24"/>
+            <w:highlight w:val="yellow"/>
+          </w:rPr>
+          <w:t>sU</w:t>
+        </w:r>
+      </w:hyperlink>
+      <w:r>
+        <w:rPr>
+          <w:rFonts w:ascii="Arial" w:hAnsi="Arial" w:cs="Arial"/>
+          <w:b/>
+          <w:bCs/>
+          <w:sz w:val="24"/>
+          <w:szCs w:val="24"/>
+        </w:rPr>
+        <w:t xml:space="preserve"> </w:t>
+      </w:r>
+      <w:r>
+        <w:rPr>
+          <w:rFonts w:ascii="Arial" w:hAnsi="Arial" w:cs="Arial"/>
+          <w:b/>
+          <w:bCs/>
+          <w:sz w:val="24"/>
+          <w:szCs w:val="24"/>
+        </w:rPr>
+        <w:t xml:space="preserve"> (</w:t>
+      </w:r>
+      <w:r>
+        <w:rPr>
+          <w:rFonts w:ascii="Arial" w:hAnsi="Arial" w:cs="Arial"/>
+          <w:sz w:val="24"/>
+          <w:szCs w:val="24"/>
+        </w:rPr>
+        <w:t xml:space="preserve">Youtube – </w:t>
+      </w:r>
+      <w:r>
+        <w:rPr>
+          <w:rFonts w:ascii="Arial" w:hAnsi="Arial" w:cs="Arial"/>
+          <w:sz w:val="24"/>
+          <w:szCs w:val="24"/>
+        </w:rPr>
+        <w:t>Informática – módulo 1 -agenda 10</w:t>
+      </w:r>
+      <w:r>
+        <w:rPr>
+          <w:rFonts w:ascii="Arial" w:hAnsi="Arial" w:cs="Arial"/>
+          <w:sz w:val="24"/>
+          <w:szCs w:val="24"/>
+        </w:rPr>
+        <w:t xml:space="preserve"> – GEEaD).</w:t>
+      </w:r>
+    </w:p>
+    <w:p>
+      <w:pPr>
+        <w:jc w:val="both"/>
+        <w:rPr>
+          <w:rFonts w:ascii="Arial" w:hAnsi="Arial" w:cs="Arial"/>
+          <w:sz w:val="24"/>
+          <w:szCs w:val="24"/>
+        </w:rPr>
+      </w:pPr>
+      <w:r>
+        <w:rPr>
+          <w:rFonts w:ascii="Arial" w:hAnsi="Arial" w:cs="Arial"/>
+          <w:b/>
+          <w:bCs/>
+          <w:sz w:val="24"/>
+          <w:szCs w:val="24"/>
+        </w:rPr>
+        <w:sym w:font="Wingdings" w:char="F0E0"/>
+      </w:r>
+      <w:r>
+        <w:rPr>
+          <w:rFonts w:ascii="Arial" w:hAnsi="Arial" w:cs="Arial"/>
+          <w:b/>
+          <w:bCs/>
+          <w:sz w:val="24"/>
+          <w:szCs w:val="24"/>
+        </w:rPr>
+        <w:t xml:space="preserve"> </w:t>
+      </w:r>
+      <w:hyperlink r:id="rId18" w:history="1">
+        <w:r>
+          <w:rPr>
+            <w:rStyle w:val="Hyperlink"/>
+            <w:rFonts w:ascii="Arial" w:hAnsi="Arial" w:cs="Arial"/>
+            <w:b/>
+            <w:bCs/>
+            <w:sz w:val="24"/>
+            <w:szCs w:val="24"/>
+          </w:rPr>
+          <w:t>https://www.youtube.com/watch?v=Ig4QZNp</w:t>
         </w:r>
         <w:r>
           <w:rPr>
@@ -5099,7 +5580,7 @@
             <w:sz w:val="24"/>
             <w:szCs w:val="24"/>
           </w:rPr>
-          <w:t>b</w:t>
+          <w:t>V</w:t>
         </w:r>
         <w:r>
           <w:rPr>
@@ -5110,7 +5591,7 @@
             <w:sz w:val="24"/>
             <w:szCs w:val="24"/>
           </w:rPr>
-          <w:t>e.com/watch?v=2l1Hz3U_yx0</w:t>
+          <w:t>ZYs</w:t>
         </w:r>
       </w:hyperlink>
       <w:r>
@@ -5131,49 +5612,23 @@
           <w:sz w:val="24"/>
           <w:szCs w:val="24"/>
         </w:rPr>
-        <w:t xml:space="preserve"> (</w:t>
-      </w:r>
-      <w:proofErr w:type="spellStart"/>
-      <w:r>
-        <w:rPr>
-          <w:rFonts w:ascii="Arial" w:hAnsi="Arial" w:cs="Arial"/>
-          <w:sz w:val="24"/>
-          <w:szCs w:val="24"/>
-        </w:rPr>
-        <w:t>Cataline</w:t>
-      </w:r>
-      <w:proofErr w:type="spellEnd"/>
-      <w:r>
-        <w:rPr>
-          <w:rFonts w:ascii="Arial" w:hAnsi="Arial" w:cs="Arial"/>
-          <w:sz w:val="24"/>
-          <w:szCs w:val="24"/>
-        </w:rPr>
-        <w:t xml:space="preserve"> – Lógica de programação 0</w:t>
-      </w:r>
-      <w:r>
-        <w:rPr>
-          <w:rFonts w:ascii="Arial" w:hAnsi="Arial" w:cs="Arial"/>
-          <w:sz w:val="24"/>
-          <w:szCs w:val="24"/>
-        </w:rPr>
-        <w:t>8</w:t>
-      </w:r>
-      <w:r>
-        <w:rPr>
-          <w:rFonts w:ascii="Arial" w:hAnsi="Arial" w:cs="Arial"/>
-          <w:sz w:val="24"/>
-          <w:szCs w:val="24"/>
-        </w:rPr>
-        <w:t xml:space="preserve"> – Operadores </w:t>
-      </w:r>
-      <w:r>
-        <w:rPr>
-          <w:rFonts w:ascii="Arial" w:hAnsi="Arial" w:cs="Arial"/>
-          <w:sz w:val="24"/>
-          <w:szCs w:val="24"/>
-        </w:rPr>
-        <w:t>lógicos</w:t>
+        <w:t>(</w:t>
+      </w:r>
+      <w:r>
+        <w:rPr>
+          <w:rFonts w:ascii="Arial" w:hAnsi="Arial" w:cs="Arial"/>
+          <w:sz w:val="24"/>
+          <w:szCs w:val="24"/>
+        </w:rPr>
+        <w:t xml:space="preserve">Youtube – </w:t>
+      </w:r>
+      <w:r>
+        <w:rPr>
+          <w:rFonts w:ascii="Arial" w:hAnsi="Arial" w:cs="Arial"/>
+          <w:sz w:val="24"/>
+          <w:szCs w:val="24"/>
+        </w:rPr>
+        <w:t>Operadores lógicos e relacionais curso algoritmo #4 – Gustavo Guanabara</w:t>
       </w:r>
       <w:r>
         <w:rPr>
@@ -5189,8 +5644,107 @@
         <w:jc w:val="both"/>
         <w:rPr>
           <w:rFonts w:ascii="Arial" w:hAnsi="Arial" w:cs="Arial"/>
-          <w:b/>
-          <w:bCs/>
+          <w:sz w:val="24"/>
+          <w:szCs w:val="24"/>
+        </w:rPr>
+      </w:pPr>
+      <w:r>
+        <w:rPr>
+          <w:rFonts w:ascii="Arial" w:hAnsi="Arial" w:cs="Arial"/>
+          <w:sz w:val="24"/>
+          <w:szCs w:val="24"/>
+        </w:rPr>
+        <w:sym w:font="Wingdings" w:char="F0E0"/>
+      </w:r>
+      <w:r>
+        <w:rPr>
+          <w:rFonts w:ascii="Arial" w:hAnsi="Arial" w:cs="Arial"/>
+          <w:sz w:val="24"/>
+          <w:szCs w:val="24"/>
+        </w:rPr>
+        <w:t xml:space="preserve"> </w:t>
+      </w:r>
+      <w:hyperlink r:id="rId19" w:history="1">
+        <w:r>
+          <w:rPr>
+            <w:rStyle w:val="Hyperlink"/>
+            <w:rFonts w:ascii="Arial" w:hAnsi="Arial" w:cs="Arial"/>
+            <w:sz w:val="24"/>
+            <w:szCs w:val="24"/>
+          </w:rPr>
+          <w:t>https://w</w:t>
+        </w:r>
+        <w:r>
+          <w:rPr>
+            <w:rStyle w:val="Hyperlink"/>
+            <w:rFonts w:ascii="Arial" w:hAnsi="Arial" w:cs="Arial"/>
+            <w:sz w:val="24"/>
+            <w:szCs w:val="24"/>
+          </w:rPr>
+          <w:t>w</w:t>
+        </w:r>
+        <w:r>
+          <w:rPr>
+            <w:rStyle w:val="Hyperlink"/>
+            <w:rFonts w:ascii="Arial" w:hAnsi="Arial" w:cs="Arial"/>
+            <w:sz w:val="24"/>
+            <w:szCs w:val="24"/>
+          </w:rPr>
+          <w:t>w.youtube.co</w:t>
+        </w:r>
+        <w:r>
+          <w:rPr>
+            <w:rStyle w:val="Hyperlink"/>
+            <w:rFonts w:ascii="Arial" w:hAnsi="Arial" w:cs="Arial"/>
+            <w:sz w:val="24"/>
+            <w:szCs w:val="24"/>
+          </w:rPr>
+          <w:t>m</w:t>
+        </w:r>
+        <w:r>
+          <w:rPr>
+            <w:rStyle w:val="Hyperlink"/>
+            <w:rFonts w:ascii="Arial" w:hAnsi="Arial" w:cs="Arial"/>
+            <w:sz w:val="24"/>
+            <w:szCs w:val="24"/>
+          </w:rPr>
+          <w:t>/watch?v=sTX0UEplF54&amp;list=PLHz_AreHm4dkI2ZdjTwZA4mPMxWTfNSpR</w:t>
+        </w:r>
+      </w:hyperlink>
+      <w:r>
+        <w:rPr>
+          <w:rFonts w:ascii="Arial" w:hAnsi="Arial" w:cs="Arial"/>
+          <w:sz w:val="24"/>
+          <w:szCs w:val="24"/>
+        </w:rPr>
+        <w:t xml:space="preserve"> (Playlist Curso de Java para Iniciantes – Gustavo Guanabara)</w:t>
+      </w:r>
+    </w:p>
+    <w:p>
+      <w:pPr>
+        <w:jc w:val="both"/>
+        <w:rPr>
+          <w:rFonts w:ascii="Arial" w:hAnsi="Arial" w:cs="Arial"/>
+          <w:sz w:val="24"/>
+          <w:szCs w:val="24"/>
+        </w:rPr>
+      </w:pPr>
+    </w:p>
+    <w:p>
+      <w:pPr>
+        <w:jc w:val="both"/>
+        <w:rPr>
+          <w:rFonts w:ascii="Arial" w:hAnsi="Arial" w:cs="Arial"/>
+          <w:sz w:val="24"/>
+          <w:szCs w:val="24"/>
+        </w:rPr>
+      </w:pPr>
+    </w:p>
+    <w:p>
+      <w:pPr>
+        <w:jc w:val="both"/>
+        <w:rPr>
+          <w:rFonts w:ascii="Arial" w:hAnsi="Arial" w:cs="Arial"/>
           <w:sz w:val="24"/>
           <w:szCs w:val="24"/>
         </w:rPr>

</xml_diff>